<commit_message>
at 050621-T11-33 at middle of f06_risk
</commit_message>
<xml_diff>
--- a/f03_features/time_features/contract_1_050526.docx
+++ b/f03_features/time_features/contract_1_050526.docx
@@ -5,7 +5,7 @@
     <w:p>
       <w:pPr>
         <w:bidi/>
-        <w:spacing w:before="100" w:beforeAutospacing="1" w:after="100" w:afterAutospacing="1" w:line="240" w:lineRule="auto"/>
+        <w:spacing w:after="0" w:line="240" w:lineRule="auto"/>
         <w:jc w:val="both"/>
         <w:rPr>
           <w:rFonts w:ascii="Times New Roman" w:eastAsia="Times New Roman" w:hAnsi="Times New Roman" w:cs="Times New Roman"/>
@@ -15,14 +15,44 @@
       </w:pPr>
       <w:r>
         <w:rPr>
+          <w:rFonts w:hint="cs"/>
           <w:highlight w:val="yellow"/>
           <w:rtl/>
         </w:rPr>
-        <w:t>فعلاً در پروژه من فقط 23 اندیکاتور تعریف شده اند. یک فایل وجود دارد که دارای 23 کلاس ریاضی است. در پایین ترین لایه است. در یک لایه بالاتر دو فایل وجود دارند که آنها هم همان 23 اندیکاتور را دارند. البته کمی متفاوت تر. یکی از این دو فایل اندیکاتورهای</w:t>
+        <w:t xml:space="preserve">من گفتم: </w:t>
       </w:r>
       <w:r>
         <w:rPr>
           <w:highlight w:val="yellow"/>
+          <w:rtl/>
+        </w:rPr>
+        <w:t xml:space="preserve">فعلاً در پروژه من فقط 23 اندیکاتور تعریف شده اند. یک فایل وجود </w:t>
+      </w:r>
+      <w:r>
+        <w:rPr>
+          <w:highlight w:val="yellow"/>
+          <w:rtl/>
+        </w:rPr>
+        <w:t>دارد که دارای 23 کلاس ریاضی است</w:t>
+      </w:r>
+      <w:r>
+        <w:rPr>
+          <w:rFonts w:hint="cs"/>
+          <w:highlight w:val="yellow"/>
+          <w:rtl/>
+        </w:rPr>
+        <w:t xml:space="preserve"> و</w:t>
+      </w:r>
+      <w:r>
+        <w:rPr>
+          <w:highlight w:val="yellow"/>
+          <w:rtl/>
+        </w:rPr>
+        <w:t xml:space="preserve"> در پایین ترین لایه است. در یک لایه بالاتر دو فایل وجود دارند که آنها هم همان 23 اندیکاتور را دارند. البته کمی متفاوت تر. یکی از این دو فایل اندیکاتورهای</w:t>
+      </w:r>
+      <w:r>
+        <w:rPr>
+          <w:highlight w:val="yellow"/>
         </w:rPr>
         <w:t xml:space="preserve"> batch </w:t>
       </w:r>
@@ -198,7 +228,7 @@
     <w:p>
       <w:pPr>
         <w:bidi/>
-        <w:spacing w:before="100" w:beforeAutospacing="1" w:after="100" w:afterAutospacing="1" w:line="240" w:lineRule="auto"/>
+        <w:spacing w:after="0" w:line="240" w:lineRule="auto"/>
         <w:rPr>
           <w:rFonts w:ascii="Times New Roman" w:eastAsia="Times New Roman" w:hAnsi="Times New Roman" w:cs="Times New Roman"/>
           <w:sz w:val="24"/>
@@ -804,7 +834,7 @@
     <w:p>
       <w:pPr>
         <w:bidi/>
-        <w:spacing w:before="100" w:beforeAutospacing="1" w:after="100" w:afterAutospacing="1" w:line="240" w:lineRule="auto"/>
+        <w:spacing w:after="0" w:line="240" w:lineRule="auto"/>
         <w:rPr>
           <w:rFonts w:ascii="Times New Roman" w:eastAsia="Times New Roman" w:hAnsi="Times New Roman" w:cs="Times New Roman"/>
           <w:sz w:val="24"/>
@@ -870,7 +900,7 @@
     <w:p>
       <w:pPr>
         <w:bidi/>
-        <w:spacing w:before="100" w:beforeAutospacing="1" w:after="100" w:afterAutospacing="1" w:line="240" w:lineRule="auto"/>
+        <w:spacing w:after="0" w:line="240" w:lineRule="auto"/>
         <w:rPr>
           <w:rFonts w:ascii="Times New Roman" w:eastAsia="Times New Roman" w:hAnsi="Times New Roman" w:cs="Times New Roman"/>
           <w:sz w:val="24"/>
@@ -925,7 +955,7 @@
     <w:p>
       <w:pPr>
         <w:bidi/>
-        <w:spacing w:before="100" w:beforeAutospacing="1" w:after="100" w:afterAutospacing="1" w:line="240" w:lineRule="auto"/>
+        <w:spacing w:after="0" w:line="240" w:lineRule="auto"/>
         <w:rPr>
           <w:rFonts w:ascii="Times New Roman" w:eastAsia="Times New Roman" w:hAnsi="Times New Roman" w:cs="Times New Roman"/>
           <w:sz w:val="24"/>
@@ -1359,7 +1389,7 @@
     <w:p>
       <w:pPr>
         <w:bidi/>
-        <w:spacing w:before="100" w:beforeAutospacing="1" w:after="100" w:afterAutospacing="1" w:line="240" w:lineRule="auto"/>
+        <w:spacing w:after="0" w:line="240" w:lineRule="auto"/>
         <w:rPr>
           <w:rFonts w:ascii="Times New Roman" w:eastAsia="Times New Roman" w:hAnsi="Times New Roman" w:cs="Times New Roman"/>
           <w:sz w:val="24"/>
@@ -1425,7 +1455,7 @@
     <w:p>
       <w:pPr>
         <w:bidi/>
-        <w:spacing w:before="100" w:beforeAutospacing="1" w:after="100" w:afterAutospacing="1" w:line="240" w:lineRule="auto"/>
+        <w:spacing w:after="0" w:line="240" w:lineRule="auto"/>
         <w:rPr>
           <w:rFonts w:ascii="Times New Roman" w:eastAsia="Times New Roman" w:hAnsi="Times New Roman" w:cs="Times New Roman"/>
           <w:sz w:val="24"/>
@@ -1521,7 +1551,7 @@
     <w:p>
       <w:pPr>
         <w:bidi/>
-        <w:spacing w:before="100" w:beforeAutospacing="1" w:after="100" w:afterAutospacing="1" w:line="240" w:lineRule="auto"/>
+        <w:spacing w:after="0" w:line="240" w:lineRule="auto"/>
         <w:rPr>
           <w:rFonts w:ascii="Times New Roman" w:eastAsia="Times New Roman" w:hAnsi="Times New Roman" w:cs="Times New Roman"/>
           <w:sz w:val="24"/>
@@ -1549,7 +1579,7 @@
     <w:p>
       <w:pPr>
         <w:bidi/>
-        <w:spacing w:before="100" w:beforeAutospacing="1" w:after="100" w:afterAutospacing="1" w:line="240" w:lineRule="auto"/>
+        <w:spacing w:after="0" w:line="240" w:lineRule="auto"/>
         <w:outlineLvl w:val="2"/>
         <w:rPr>
           <w:rFonts w:ascii="Times New Roman" w:eastAsia="Times New Roman" w:hAnsi="Times New Roman" w:cs="Times New Roman"/>
@@ -1584,7 +1614,7 @@
     <w:p>
       <w:pPr>
         <w:bidi/>
-        <w:spacing w:before="100" w:beforeAutospacing="1" w:after="100" w:afterAutospacing="1" w:line="240" w:lineRule="auto"/>
+        <w:spacing w:after="0" w:line="240" w:lineRule="auto"/>
         <w:rPr>
           <w:rFonts w:ascii="Times New Roman" w:eastAsia="Times New Roman" w:hAnsi="Times New Roman" w:cs="Times New Roman"/>
           <w:sz w:val="24"/>
@@ -1885,53 +1915,724 @@
           <w:sz w:val="20"/>
           <w:szCs w:val="20"/>
         </w:rPr>
+        <w:t>│</w:t>
+      </w:r>
+    </w:p>
+    <w:p>
+      <w:pPr>
+        <w:tabs>
+          <w:tab w:val="left" w:pos="916"/>
+          <w:tab w:val="left" w:pos="1832"/>
+          <w:tab w:val="left" w:pos="2748"/>
+          <w:tab w:val="left" w:pos="3664"/>
+          <w:tab w:val="left" w:pos="4580"/>
+          <w:tab w:val="left" w:pos="5496"/>
+          <w:tab w:val="left" w:pos="6412"/>
+          <w:tab w:val="left" w:pos="7328"/>
+          <w:tab w:val="left" w:pos="8244"/>
+          <w:tab w:val="left" w:pos="9160"/>
+          <w:tab w:val="left" w:pos="10076"/>
+          <w:tab w:val="left" w:pos="10992"/>
+          <w:tab w:val="left" w:pos="11908"/>
+          <w:tab w:val="left" w:pos="12824"/>
+          <w:tab w:val="left" w:pos="13740"/>
+          <w:tab w:val="left" w:pos="14656"/>
+        </w:tabs>
+        <w:spacing w:after="0" w:line="240" w:lineRule="auto"/>
+        <w:rPr>
+          <w:rFonts w:ascii="Courier New" w:eastAsia="Times New Roman" w:hAnsi="Courier New" w:cs="Courier New"/>
+          <w:sz w:val="20"/>
+          <w:szCs w:val="20"/>
+        </w:rPr>
+      </w:pPr>
+      <w:r>
+        <w:rPr>
+          <w:rFonts w:ascii="Courier New" w:eastAsia="Times New Roman" w:hAnsi="Courier New" w:cs="Courier New"/>
+          <w:sz w:val="20"/>
+          <w:szCs w:val="20"/>
+        </w:rPr>
+        <w:t xml:space="preserve">├── </w:t>
+      </w:r>
+      <w:proofErr w:type="spellStart"/>
+      <w:r>
+        <w:rPr>
+          <w:rFonts w:ascii="Courier New" w:eastAsia="Times New Roman" w:hAnsi="Courier New" w:cs="Courier New"/>
+          <w:sz w:val="20"/>
+          <w:szCs w:val="20"/>
+        </w:rPr>
+        <w:t>time_features</w:t>
+      </w:r>
+      <w:proofErr w:type="spellEnd"/>
+    </w:p>
+    <w:p>
+      <w:pPr>
+        <w:tabs>
+          <w:tab w:val="left" w:pos="916"/>
+          <w:tab w:val="left" w:pos="1832"/>
+          <w:tab w:val="left" w:pos="2748"/>
+          <w:tab w:val="left" w:pos="3664"/>
+          <w:tab w:val="left" w:pos="4580"/>
+          <w:tab w:val="left" w:pos="5496"/>
+          <w:tab w:val="left" w:pos="6412"/>
+          <w:tab w:val="left" w:pos="7328"/>
+          <w:tab w:val="left" w:pos="8244"/>
+          <w:tab w:val="left" w:pos="9160"/>
+          <w:tab w:val="left" w:pos="10076"/>
+          <w:tab w:val="left" w:pos="10992"/>
+          <w:tab w:val="left" w:pos="11908"/>
+          <w:tab w:val="left" w:pos="12824"/>
+          <w:tab w:val="left" w:pos="13740"/>
+          <w:tab w:val="left" w:pos="14656"/>
+        </w:tabs>
+        <w:spacing w:after="0" w:line="240" w:lineRule="auto"/>
+        <w:rPr>
+          <w:rFonts w:ascii="Courier New" w:eastAsia="Times New Roman" w:hAnsi="Courier New" w:cs="Courier New"/>
+          <w:sz w:val="20"/>
+          <w:szCs w:val="20"/>
+        </w:rPr>
+      </w:pPr>
+      <w:r>
+        <w:rPr>
+          <w:rFonts w:ascii="Courier New" w:eastAsia="Times New Roman" w:hAnsi="Courier New" w:cs="Courier New"/>
+          <w:sz w:val="20"/>
+          <w:szCs w:val="20"/>
+        </w:rPr>
+        <w:t>│      ├── time_feature_engine.py</w:t>
+      </w:r>
+    </w:p>
+    <w:p>
+      <w:pPr>
+        <w:tabs>
+          <w:tab w:val="left" w:pos="916"/>
+          <w:tab w:val="left" w:pos="1832"/>
+          <w:tab w:val="left" w:pos="2748"/>
+          <w:tab w:val="left" w:pos="3664"/>
+          <w:tab w:val="left" w:pos="4580"/>
+          <w:tab w:val="left" w:pos="5496"/>
+          <w:tab w:val="left" w:pos="6412"/>
+          <w:tab w:val="left" w:pos="7328"/>
+          <w:tab w:val="left" w:pos="8244"/>
+          <w:tab w:val="left" w:pos="9160"/>
+          <w:tab w:val="left" w:pos="10076"/>
+          <w:tab w:val="left" w:pos="10992"/>
+          <w:tab w:val="left" w:pos="11908"/>
+          <w:tab w:val="left" w:pos="12824"/>
+          <w:tab w:val="left" w:pos="13740"/>
+          <w:tab w:val="left" w:pos="14656"/>
+        </w:tabs>
+        <w:spacing w:after="0" w:line="240" w:lineRule="auto"/>
+        <w:rPr>
+          <w:rFonts w:ascii="Courier New" w:eastAsia="Times New Roman" w:hAnsi="Courier New" w:cs="Courier New"/>
+          <w:sz w:val="20"/>
+          <w:szCs w:val="20"/>
+        </w:rPr>
+      </w:pPr>
+      <w:r>
+        <w:rPr>
+          <w:rFonts w:ascii="Courier New" w:eastAsia="Times New Roman" w:hAnsi="Courier New" w:cs="Courier New"/>
+          <w:sz w:val="20"/>
+          <w:szCs w:val="20"/>
+        </w:rPr>
+        <w:t>│      └── time_feature_functions.py</w:t>
+      </w:r>
+    </w:p>
+    <w:p>
+      <w:pPr>
+        <w:tabs>
+          <w:tab w:val="left" w:pos="916"/>
+          <w:tab w:val="left" w:pos="1832"/>
+          <w:tab w:val="left" w:pos="2748"/>
+          <w:tab w:val="left" w:pos="3664"/>
+          <w:tab w:val="left" w:pos="4580"/>
+          <w:tab w:val="left" w:pos="5496"/>
+          <w:tab w:val="left" w:pos="6412"/>
+          <w:tab w:val="left" w:pos="7328"/>
+          <w:tab w:val="left" w:pos="8244"/>
+          <w:tab w:val="left" w:pos="9160"/>
+          <w:tab w:val="left" w:pos="10076"/>
+          <w:tab w:val="left" w:pos="10992"/>
+          <w:tab w:val="left" w:pos="11908"/>
+          <w:tab w:val="left" w:pos="12824"/>
+          <w:tab w:val="left" w:pos="13740"/>
+          <w:tab w:val="left" w:pos="14656"/>
+        </w:tabs>
+        <w:spacing w:after="0" w:line="240" w:lineRule="auto"/>
+        <w:rPr>
+          <w:rFonts w:ascii="Courier New" w:eastAsia="Times New Roman" w:hAnsi="Courier New" w:cs="Courier New"/>
+          <w:sz w:val="20"/>
+          <w:szCs w:val="20"/>
+        </w:rPr>
+      </w:pPr>
+      <w:r>
+        <w:rPr>
+          <w:rFonts w:ascii="Courier New" w:eastAsia="Times New Roman" w:hAnsi="Courier New" w:cs="Courier New"/>
+          <w:sz w:val="20"/>
+          <w:szCs w:val="20"/>
+        </w:rPr>
+        <w:t>│</w:t>
+      </w:r>
+    </w:p>
+    <w:p>
+      <w:pPr>
+        <w:tabs>
+          <w:tab w:val="left" w:pos="916"/>
+          <w:tab w:val="left" w:pos="1832"/>
+          <w:tab w:val="left" w:pos="2748"/>
+          <w:tab w:val="left" w:pos="3664"/>
+          <w:tab w:val="left" w:pos="4580"/>
+          <w:tab w:val="left" w:pos="5496"/>
+          <w:tab w:val="left" w:pos="6412"/>
+          <w:tab w:val="left" w:pos="7328"/>
+          <w:tab w:val="left" w:pos="8244"/>
+          <w:tab w:val="left" w:pos="9160"/>
+          <w:tab w:val="left" w:pos="10076"/>
+          <w:tab w:val="left" w:pos="10992"/>
+          <w:tab w:val="left" w:pos="11908"/>
+          <w:tab w:val="left" w:pos="12824"/>
+          <w:tab w:val="left" w:pos="13740"/>
+          <w:tab w:val="left" w:pos="14656"/>
+        </w:tabs>
+        <w:spacing w:after="0" w:line="240" w:lineRule="auto"/>
+        <w:rPr>
+          <w:rFonts w:ascii="Courier New" w:eastAsia="Times New Roman" w:hAnsi="Courier New" w:cs="Courier New"/>
+          <w:sz w:val="20"/>
+          <w:szCs w:val="20"/>
+        </w:rPr>
+      </w:pPr>
+      <w:r>
+        <w:rPr>
+          <w:rFonts w:ascii="Courier New" w:eastAsia="Times New Roman" w:hAnsi="Courier New" w:cs="Courier New"/>
+          <w:sz w:val="20"/>
+          <w:szCs w:val="20"/>
+        </w:rPr>
+        <w:t xml:space="preserve">├── </w:t>
+      </w:r>
+      <w:proofErr w:type="spellStart"/>
+      <w:r>
+        <w:rPr>
+          <w:rFonts w:ascii="Courier New" w:eastAsia="Times New Roman" w:hAnsi="Courier New" w:cs="Courier New"/>
+          <w:sz w:val="20"/>
+          <w:szCs w:val="20"/>
+        </w:rPr>
+        <w:t>feature_registry</w:t>
+      </w:r>
+      <w:proofErr w:type="spellEnd"/>
+    </w:p>
+    <w:p>
+      <w:pPr>
+        <w:tabs>
+          <w:tab w:val="left" w:pos="916"/>
+          <w:tab w:val="left" w:pos="1832"/>
+          <w:tab w:val="left" w:pos="2748"/>
+          <w:tab w:val="left" w:pos="3664"/>
+          <w:tab w:val="left" w:pos="4580"/>
+          <w:tab w:val="left" w:pos="5496"/>
+          <w:tab w:val="left" w:pos="6412"/>
+          <w:tab w:val="left" w:pos="7328"/>
+          <w:tab w:val="left" w:pos="8244"/>
+          <w:tab w:val="left" w:pos="9160"/>
+          <w:tab w:val="left" w:pos="10076"/>
+          <w:tab w:val="left" w:pos="10992"/>
+          <w:tab w:val="left" w:pos="11908"/>
+          <w:tab w:val="left" w:pos="12824"/>
+          <w:tab w:val="left" w:pos="13740"/>
+          <w:tab w:val="left" w:pos="14656"/>
+        </w:tabs>
+        <w:spacing w:after="0" w:line="240" w:lineRule="auto"/>
+        <w:rPr>
+          <w:rFonts w:ascii="Courier New" w:eastAsia="Times New Roman" w:hAnsi="Courier New" w:cs="Courier New"/>
+          <w:sz w:val="20"/>
+          <w:szCs w:val="20"/>
+        </w:rPr>
+      </w:pPr>
+      <w:r>
+        <w:rPr>
+          <w:rFonts w:ascii="Courier New" w:eastAsia="Times New Roman" w:hAnsi="Courier New" w:cs="Courier New"/>
+          <w:sz w:val="20"/>
+          <w:szCs w:val="20"/>
+        </w:rPr>
+        <w:t xml:space="preserve">├── </w:t>
+      </w:r>
+      <w:proofErr w:type="spellStart"/>
+      <w:r>
+        <w:rPr>
+          <w:rFonts w:ascii="Courier New" w:eastAsia="Times New Roman" w:hAnsi="Courier New" w:cs="Courier New"/>
+          <w:sz w:val="20"/>
+          <w:szCs w:val="20"/>
+        </w:rPr>
+        <w:t>feature_engine</w:t>
+      </w:r>
+      <w:proofErr w:type="spellEnd"/>
+    </w:p>
+    <w:p>
+      <w:pPr>
+        <w:tabs>
+          <w:tab w:val="left" w:pos="916"/>
+          <w:tab w:val="left" w:pos="1832"/>
+          <w:tab w:val="left" w:pos="2748"/>
+          <w:tab w:val="left" w:pos="3664"/>
+          <w:tab w:val="left" w:pos="4580"/>
+          <w:tab w:val="left" w:pos="5496"/>
+          <w:tab w:val="left" w:pos="6412"/>
+          <w:tab w:val="left" w:pos="7328"/>
+          <w:tab w:val="left" w:pos="8244"/>
+          <w:tab w:val="left" w:pos="9160"/>
+          <w:tab w:val="left" w:pos="10076"/>
+          <w:tab w:val="left" w:pos="10992"/>
+          <w:tab w:val="left" w:pos="11908"/>
+          <w:tab w:val="left" w:pos="12824"/>
+          <w:tab w:val="left" w:pos="13740"/>
+          <w:tab w:val="left" w:pos="14656"/>
+        </w:tabs>
+        <w:spacing w:after="0" w:line="240" w:lineRule="auto"/>
+        <w:rPr>
+          <w:rFonts w:ascii="Courier New" w:eastAsia="Times New Roman" w:hAnsi="Courier New" w:cs="Courier New"/>
+          <w:sz w:val="20"/>
+          <w:szCs w:val="20"/>
+        </w:rPr>
+      </w:pPr>
+      <w:r>
+        <w:rPr>
+          <w:rFonts w:ascii="Courier New" w:eastAsia="Times New Roman" w:hAnsi="Courier New" w:cs="Courier New"/>
+          <w:sz w:val="20"/>
+          <w:szCs w:val="20"/>
+        </w:rPr>
+        <w:t xml:space="preserve">├── </w:t>
+      </w:r>
+      <w:proofErr w:type="spellStart"/>
+      <w:r>
+        <w:rPr>
+          <w:rFonts w:ascii="Courier New" w:eastAsia="Times New Roman" w:hAnsi="Courier New" w:cs="Courier New"/>
+          <w:sz w:val="20"/>
+          <w:szCs w:val="20"/>
+        </w:rPr>
+        <w:t>feature_pipeline</w:t>
+      </w:r>
+      <w:proofErr w:type="spellEnd"/>
+    </w:p>
+    <w:p>
+      <w:pPr>
+        <w:tabs>
+          <w:tab w:val="left" w:pos="916"/>
+          <w:tab w:val="left" w:pos="1832"/>
+          <w:tab w:val="left" w:pos="2748"/>
+          <w:tab w:val="left" w:pos="3664"/>
+          <w:tab w:val="left" w:pos="4580"/>
+          <w:tab w:val="left" w:pos="5496"/>
+          <w:tab w:val="left" w:pos="6412"/>
+          <w:tab w:val="left" w:pos="7328"/>
+          <w:tab w:val="left" w:pos="8244"/>
+          <w:tab w:val="left" w:pos="9160"/>
+          <w:tab w:val="left" w:pos="10076"/>
+          <w:tab w:val="left" w:pos="10992"/>
+          <w:tab w:val="left" w:pos="11908"/>
+          <w:tab w:val="left" w:pos="12824"/>
+          <w:tab w:val="left" w:pos="13740"/>
+          <w:tab w:val="left" w:pos="14656"/>
+        </w:tabs>
+        <w:spacing w:after="0" w:line="240" w:lineRule="auto"/>
+        <w:rPr>
+          <w:rFonts w:ascii="Courier New" w:eastAsia="Times New Roman" w:hAnsi="Courier New" w:cs="Courier New"/>
+          <w:sz w:val="20"/>
+          <w:szCs w:val="20"/>
+        </w:rPr>
+      </w:pPr>
+      <w:r>
+        <w:rPr>
+          <w:rFonts w:ascii="Courier New" w:eastAsia="Times New Roman" w:hAnsi="Courier New" w:cs="Courier New"/>
+          <w:sz w:val="20"/>
+          <w:szCs w:val="20"/>
+        </w:rPr>
+        <w:t xml:space="preserve">├── </w:t>
+      </w:r>
+      <w:proofErr w:type="spellStart"/>
+      <w:r>
+        <w:rPr>
+          <w:rFonts w:ascii="Courier New" w:eastAsia="Times New Roman" w:hAnsi="Courier New" w:cs="Courier New"/>
+          <w:sz w:val="20"/>
+          <w:szCs w:val="20"/>
+        </w:rPr>
+        <w:t>feature_store</w:t>
+      </w:r>
+      <w:proofErr w:type="spellEnd"/>
+    </w:p>
+    <w:p>
+      <w:pPr>
+        <w:tabs>
+          <w:tab w:val="left" w:pos="916"/>
+          <w:tab w:val="left" w:pos="1832"/>
+          <w:tab w:val="left" w:pos="2748"/>
+          <w:tab w:val="left" w:pos="3664"/>
+          <w:tab w:val="left" w:pos="4580"/>
+          <w:tab w:val="left" w:pos="5496"/>
+          <w:tab w:val="left" w:pos="6412"/>
+          <w:tab w:val="left" w:pos="7328"/>
+          <w:tab w:val="left" w:pos="8244"/>
+          <w:tab w:val="left" w:pos="9160"/>
+          <w:tab w:val="left" w:pos="10076"/>
+          <w:tab w:val="left" w:pos="10992"/>
+          <w:tab w:val="left" w:pos="11908"/>
+          <w:tab w:val="left" w:pos="12824"/>
+          <w:tab w:val="left" w:pos="13740"/>
+          <w:tab w:val="left" w:pos="14656"/>
+        </w:tabs>
+        <w:spacing w:after="0" w:line="240" w:lineRule="auto"/>
+        <w:rPr>
+          <w:rFonts w:ascii="Courier New" w:eastAsia="Times New Roman" w:hAnsi="Courier New" w:cs="Courier New"/>
+          <w:sz w:val="20"/>
+          <w:szCs w:val="20"/>
+        </w:rPr>
+      </w:pPr>
+      <w:r>
+        <w:rPr>
+          <w:rFonts w:ascii="Courier New" w:eastAsia="Times New Roman" w:hAnsi="Courier New" w:cs="Courier New"/>
+          <w:sz w:val="20"/>
+          <w:szCs w:val="20"/>
+        </w:rPr>
+        <w:t xml:space="preserve">├── </w:t>
+      </w:r>
+      <w:proofErr w:type="spellStart"/>
+      <w:r>
+        <w:rPr>
+          <w:rFonts w:ascii="Courier New" w:eastAsia="Times New Roman" w:hAnsi="Courier New" w:cs="Courier New"/>
+          <w:sz w:val="20"/>
+          <w:szCs w:val="20"/>
+        </w:rPr>
+        <w:t>observation_builder</w:t>
+      </w:r>
+      <w:proofErr w:type="spellEnd"/>
+    </w:p>
+    <w:p>
+      <w:pPr>
+        <w:tabs>
+          <w:tab w:val="left" w:pos="916"/>
+          <w:tab w:val="left" w:pos="1832"/>
+          <w:tab w:val="left" w:pos="2748"/>
+          <w:tab w:val="left" w:pos="3664"/>
+          <w:tab w:val="left" w:pos="4580"/>
+          <w:tab w:val="left" w:pos="5496"/>
+          <w:tab w:val="left" w:pos="6412"/>
+          <w:tab w:val="left" w:pos="7328"/>
+          <w:tab w:val="left" w:pos="8244"/>
+          <w:tab w:val="left" w:pos="9160"/>
+          <w:tab w:val="left" w:pos="10076"/>
+          <w:tab w:val="left" w:pos="10992"/>
+          <w:tab w:val="left" w:pos="11908"/>
+          <w:tab w:val="left" w:pos="12824"/>
+          <w:tab w:val="left" w:pos="13740"/>
+          <w:tab w:val="left" w:pos="14656"/>
+        </w:tabs>
+        <w:spacing w:after="0" w:line="240" w:lineRule="auto"/>
+        <w:rPr>
+          <w:rFonts w:ascii="Courier New" w:eastAsia="Times New Roman" w:hAnsi="Courier New" w:cs="Courier New"/>
+          <w:sz w:val="20"/>
+          <w:szCs w:val="20"/>
+        </w:rPr>
+      </w:pPr>
+      <w:r>
+        <w:rPr>
+          <w:rFonts w:ascii="Courier New" w:eastAsia="Times New Roman" w:hAnsi="Courier New" w:cs="Courier New"/>
+          <w:sz w:val="20"/>
+          <w:szCs w:val="20"/>
+        </w:rPr>
+        <w:t>...</w:t>
+      </w:r>
+    </w:p>
+    <w:p>
+      <w:pPr>
+        <w:bidi/>
+        <w:spacing w:after="0" w:line="240" w:lineRule="auto"/>
+        <w:rPr>
+          <w:rFonts w:ascii="Times New Roman" w:eastAsia="Times New Roman" w:hAnsi="Times New Roman" w:cs="Times New Roman"/>
+          <w:sz w:val="24"/>
+          <w:szCs w:val="24"/>
+          <w:highlight w:val="cyan"/>
+        </w:rPr>
+      </w:pPr>
+      <w:r>
+        <w:rPr>
+          <w:rFonts w:ascii="Times New Roman" w:eastAsia="Times New Roman" w:hAnsi="Times New Roman" w:cs="Times New Roman"/>
+          <w:sz w:val="24"/>
+          <w:szCs w:val="24"/>
+          <w:highlight w:val="cyan"/>
+          <w:rtl/>
+        </w:rPr>
+        <w:t xml:space="preserve">و بعد </w:t>
+      </w:r>
+      <w:proofErr w:type="spellStart"/>
+      <w:r>
+        <w:rPr>
+          <w:rFonts w:ascii="Courier New" w:eastAsia="Times New Roman" w:hAnsi="Courier New" w:cs="Courier New"/>
+          <w:sz w:val="20"/>
+          <w:szCs w:val="20"/>
+          <w:highlight w:val="cyan"/>
+        </w:rPr>
+        <w:t>FeatureEngine</w:t>
+      </w:r>
+      <w:proofErr w:type="spellEnd"/>
+      <w:r>
+        <w:rPr>
+          <w:rFonts w:ascii="Times New Roman" w:eastAsia="Times New Roman" w:hAnsi="Times New Roman" w:cs="Times New Roman"/>
+          <w:sz w:val="24"/>
+          <w:szCs w:val="24"/>
+          <w:highlight w:val="cyan"/>
+        </w:rPr>
+        <w:t xml:space="preserve"> </w:t>
+      </w:r>
+      <w:r>
+        <w:rPr>
+          <w:rFonts w:ascii="Times New Roman" w:eastAsia="Times New Roman" w:hAnsi="Times New Roman" w:cs="Times New Roman"/>
+          <w:sz w:val="24"/>
+          <w:szCs w:val="24"/>
+          <w:highlight w:val="cyan"/>
+          <w:rtl/>
+        </w:rPr>
+        <w:t xml:space="preserve">یا </w:t>
+      </w:r>
+      <w:proofErr w:type="spellStart"/>
+      <w:r>
+        <w:rPr>
+          <w:rFonts w:ascii="Courier New" w:eastAsia="Times New Roman" w:hAnsi="Courier New" w:cs="Courier New"/>
+          <w:sz w:val="20"/>
+          <w:szCs w:val="20"/>
+          <w:highlight w:val="cyan"/>
+        </w:rPr>
+        <w:t>FeaturePipeline</w:t>
+      </w:r>
+      <w:proofErr w:type="spellEnd"/>
+      <w:r>
+        <w:rPr>
+          <w:rFonts w:ascii="Times New Roman" w:eastAsia="Times New Roman" w:hAnsi="Times New Roman" w:cs="Times New Roman"/>
+          <w:sz w:val="24"/>
+          <w:szCs w:val="24"/>
+          <w:highlight w:val="cyan"/>
+        </w:rPr>
+        <w:t xml:space="preserve"> </w:t>
+      </w:r>
+      <w:r>
+        <w:rPr>
+          <w:rFonts w:ascii="Times New Roman" w:eastAsia="Times New Roman" w:hAnsi="Times New Roman" w:cs="Times New Roman"/>
+          <w:sz w:val="24"/>
+          <w:szCs w:val="24"/>
+          <w:highlight w:val="cyan"/>
+          <w:rtl/>
+        </w:rPr>
+        <w:t>تصمیم بگیرد که این</w:t>
+      </w:r>
+      <w:r>
+        <w:rPr>
+          <w:rFonts w:ascii="Times New Roman" w:eastAsia="Times New Roman" w:hAnsi="Times New Roman" w:cs="Times New Roman"/>
+          <w:sz w:val="24"/>
+          <w:szCs w:val="24"/>
+          <w:highlight w:val="cyan"/>
+        </w:rPr>
+        <w:t xml:space="preserve"> feature</w:t>
+      </w:r>
+      <w:r>
+        <w:rPr>
+          <w:rFonts w:ascii="Times New Roman" w:eastAsia="Times New Roman" w:hAnsi="Times New Roman" w:cs="Times New Roman"/>
+          <w:sz w:val="24"/>
+          <w:szCs w:val="24"/>
+          <w:highlight w:val="cyan"/>
+          <w:rtl/>
+        </w:rPr>
+        <w:t>ها را هم به خروجی اضافه کند</w:t>
+      </w:r>
+      <w:r>
+        <w:rPr>
+          <w:rFonts w:ascii="Times New Roman" w:eastAsia="Times New Roman" w:hAnsi="Times New Roman" w:cs="Times New Roman"/>
+          <w:sz w:val="24"/>
+          <w:szCs w:val="24"/>
+          <w:highlight w:val="cyan"/>
+        </w:rPr>
+        <w:t>.</w:t>
+      </w:r>
+    </w:p>
+    <w:p>
+      <w:pPr>
+        <w:bidi/>
+        <w:spacing w:after="0" w:line="240" w:lineRule="auto"/>
+        <w:rPr>
+          <w:rFonts w:ascii="Times New Roman" w:eastAsia="Times New Roman" w:hAnsi="Times New Roman" w:cs="Times New Roman"/>
+          <w:sz w:val="24"/>
+          <w:szCs w:val="24"/>
+          <w:highlight w:val="cyan"/>
+        </w:rPr>
+      </w:pPr>
+      <w:r>
+        <w:rPr>
+          <w:rFonts w:ascii="Times New Roman" w:eastAsia="Times New Roman" w:hAnsi="Times New Roman" w:cs="Times New Roman"/>
+          <w:sz w:val="24"/>
+          <w:szCs w:val="24"/>
+          <w:highlight w:val="cyan"/>
+          <w:rtl/>
+        </w:rPr>
+        <w:t>یعنی مسیر</w:t>
+      </w:r>
+      <w:r>
+        <w:rPr>
+          <w:rFonts w:ascii="Times New Roman" w:eastAsia="Times New Roman" w:hAnsi="Times New Roman" w:cs="Times New Roman"/>
+          <w:sz w:val="24"/>
+          <w:szCs w:val="24"/>
+          <w:highlight w:val="cyan"/>
+        </w:rPr>
+        <w:t>:</w:t>
+      </w:r>
+    </w:p>
+    <w:p>
+      <w:pPr>
+        <w:tabs>
+          <w:tab w:val="left" w:pos="916"/>
+          <w:tab w:val="left" w:pos="1832"/>
+          <w:tab w:val="left" w:pos="2748"/>
+          <w:tab w:val="left" w:pos="3664"/>
+          <w:tab w:val="left" w:pos="4580"/>
+          <w:tab w:val="left" w:pos="5496"/>
+          <w:tab w:val="left" w:pos="6412"/>
+          <w:tab w:val="left" w:pos="7328"/>
+          <w:tab w:val="left" w:pos="8244"/>
+          <w:tab w:val="left" w:pos="9160"/>
+          <w:tab w:val="left" w:pos="10076"/>
+          <w:tab w:val="left" w:pos="10992"/>
+          <w:tab w:val="left" w:pos="11908"/>
+          <w:tab w:val="left" w:pos="12824"/>
+          <w:tab w:val="left" w:pos="13740"/>
+          <w:tab w:val="left" w:pos="14656"/>
+        </w:tabs>
+        <w:spacing w:after="0" w:line="240" w:lineRule="auto"/>
+        <w:rPr>
+          <w:rFonts w:ascii="Courier New" w:eastAsia="Times New Roman" w:hAnsi="Courier New" w:cs="Courier New"/>
+          <w:sz w:val="20"/>
+          <w:szCs w:val="20"/>
+          <w:highlight w:val="cyan"/>
+        </w:rPr>
+      </w:pPr>
+      <w:proofErr w:type="spellStart"/>
+      <w:r>
+        <w:rPr>
+          <w:rFonts w:ascii="Courier New" w:eastAsia="Times New Roman" w:hAnsi="Courier New" w:cs="Courier New"/>
+          <w:sz w:val="20"/>
+          <w:szCs w:val="20"/>
+          <w:highlight w:val="cyan"/>
+        </w:rPr>
+        <w:t>MTFDataset</w:t>
+      </w:r>
+      <w:proofErr w:type="spellEnd"/>
+    </w:p>
+    <w:p>
+      <w:pPr>
+        <w:tabs>
+          <w:tab w:val="left" w:pos="916"/>
+          <w:tab w:val="left" w:pos="1832"/>
+          <w:tab w:val="left" w:pos="2748"/>
+          <w:tab w:val="left" w:pos="3664"/>
+          <w:tab w:val="left" w:pos="4580"/>
+          <w:tab w:val="left" w:pos="5496"/>
+          <w:tab w:val="left" w:pos="6412"/>
+          <w:tab w:val="left" w:pos="7328"/>
+          <w:tab w:val="left" w:pos="8244"/>
+          <w:tab w:val="left" w:pos="9160"/>
+          <w:tab w:val="left" w:pos="10076"/>
+          <w:tab w:val="left" w:pos="10992"/>
+          <w:tab w:val="left" w:pos="11908"/>
+          <w:tab w:val="left" w:pos="12824"/>
+          <w:tab w:val="left" w:pos="13740"/>
+          <w:tab w:val="left" w:pos="14656"/>
+        </w:tabs>
+        <w:spacing w:after="0" w:line="240" w:lineRule="auto"/>
+        <w:rPr>
+          <w:rFonts w:ascii="Courier New" w:eastAsia="Times New Roman" w:hAnsi="Courier New" w:cs="Courier New"/>
+          <w:sz w:val="20"/>
+          <w:szCs w:val="20"/>
+          <w:highlight w:val="cyan"/>
+        </w:rPr>
+      </w:pPr>
+      <w:r>
+        <w:rPr>
+          <w:rFonts w:ascii="Courier New" w:eastAsia="Times New Roman" w:hAnsi="Courier New" w:cs="Courier New"/>
+          <w:sz w:val="20"/>
+          <w:szCs w:val="20"/>
+          <w:highlight w:val="cyan"/>
+        </w:rPr>
+        <w:t xml:space="preserve">    |</w:t>
+      </w:r>
+    </w:p>
+    <w:p>
+      <w:pPr>
+        <w:tabs>
+          <w:tab w:val="left" w:pos="916"/>
+          <w:tab w:val="left" w:pos="1832"/>
+          <w:tab w:val="left" w:pos="2748"/>
+          <w:tab w:val="left" w:pos="3664"/>
+          <w:tab w:val="left" w:pos="4580"/>
+          <w:tab w:val="left" w:pos="5496"/>
+          <w:tab w:val="left" w:pos="6412"/>
+          <w:tab w:val="left" w:pos="7328"/>
+          <w:tab w:val="left" w:pos="8244"/>
+          <w:tab w:val="left" w:pos="9160"/>
+          <w:tab w:val="left" w:pos="10076"/>
+          <w:tab w:val="left" w:pos="10992"/>
+          <w:tab w:val="left" w:pos="11908"/>
+          <w:tab w:val="left" w:pos="12824"/>
+          <w:tab w:val="left" w:pos="13740"/>
+          <w:tab w:val="left" w:pos="14656"/>
+        </w:tabs>
+        <w:spacing w:after="0" w:line="240" w:lineRule="auto"/>
+        <w:rPr>
+          <w:rFonts w:ascii="Courier New" w:eastAsia="Times New Roman" w:hAnsi="Courier New" w:cs="Courier New"/>
+          <w:sz w:val="20"/>
+          <w:szCs w:val="20"/>
+          <w:highlight w:val="cyan"/>
+        </w:rPr>
+      </w:pPr>
+      <w:r>
+        <w:rPr>
+          <w:rFonts w:ascii="Courier New" w:eastAsia="Times New Roman" w:hAnsi="Courier New" w:cs="Courier New"/>
+          <w:sz w:val="20"/>
+          <w:szCs w:val="20"/>
+          <w:highlight w:val="cyan"/>
+        </w:rPr>
         <w:lastRenderedPageBreak/>
-        <w:t>│</w:t>
-      </w:r>
-    </w:p>
-    <w:p>
-      <w:pPr>
-        <w:tabs>
-          <w:tab w:val="left" w:pos="916"/>
-          <w:tab w:val="left" w:pos="1832"/>
-          <w:tab w:val="left" w:pos="2748"/>
-          <w:tab w:val="left" w:pos="3664"/>
-          <w:tab w:val="left" w:pos="4580"/>
-          <w:tab w:val="left" w:pos="5496"/>
-          <w:tab w:val="left" w:pos="6412"/>
-          <w:tab w:val="left" w:pos="7328"/>
-          <w:tab w:val="left" w:pos="8244"/>
-          <w:tab w:val="left" w:pos="9160"/>
-          <w:tab w:val="left" w:pos="10076"/>
-          <w:tab w:val="left" w:pos="10992"/>
-          <w:tab w:val="left" w:pos="11908"/>
-          <w:tab w:val="left" w:pos="12824"/>
-          <w:tab w:val="left" w:pos="13740"/>
-          <w:tab w:val="left" w:pos="14656"/>
-        </w:tabs>
-        <w:spacing w:after="0" w:line="240" w:lineRule="auto"/>
-        <w:rPr>
-          <w:rFonts w:ascii="Courier New" w:eastAsia="Times New Roman" w:hAnsi="Courier New" w:cs="Courier New"/>
-          <w:sz w:val="20"/>
-          <w:szCs w:val="20"/>
-        </w:rPr>
-      </w:pPr>
-      <w:r>
-        <w:rPr>
-          <w:rFonts w:ascii="Courier New" w:eastAsia="Times New Roman" w:hAnsi="Courier New" w:cs="Courier New"/>
-          <w:sz w:val="20"/>
-          <w:szCs w:val="20"/>
-        </w:rPr>
-        <w:t xml:space="preserve">├── </w:t>
-      </w:r>
+        <w:t xml:space="preserve">    v</w:t>
+      </w:r>
+    </w:p>
+    <w:p>
+      <w:pPr>
+        <w:tabs>
+          <w:tab w:val="left" w:pos="916"/>
+          <w:tab w:val="left" w:pos="1832"/>
+          <w:tab w:val="left" w:pos="2748"/>
+          <w:tab w:val="left" w:pos="3664"/>
+          <w:tab w:val="left" w:pos="4580"/>
+          <w:tab w:val="left" w:pos="5496"/>
+          <w:tab w:val="left" w:pos="6412"/>
+          <w:tab w:val="left" w:pos="7328"/>
+          <w:tab w:val="left" w:pos="8244"/>
+          <w:tab w:val="left" w:pos="9160"/>
+          <w:tab w:val="left" w:pos="10076"/>
+          <w:tab w:val="left" w:pos="10992"/>
+          <w:tab w:val="left" w:pos="11908"/>
+          <w:tab w:val="left" w:pos="12824"/>
+          <w:tab w:val="left" w:pos="13740"/>
+          <w:tab w:val="left" w:pos="14656"/>
+        </w:tabs>
+        <w:spacing w:after="0" w:line="240" w:lineRule="auto"/>
+        <w:rPr>
+          <w:rFonts w:ascii="Courier New" w:eastAsia="Times New Roman" w:hAnsi="Courier New" w:cs="Courier New"/>
+          <w:sz w:val="20"/>
+          <w:szCs w:val="20"/>
+          <w:highlight w:val="cyan"/>
+        </w:rPr>
+      </w:pPr>
       <w:proofErr w:type="spellStart"/>
       <w:r>
         <w:rPr>
           <w:rFonts w:ascii="Courier New" w:eastAsia="Times New Roman" w:hAnsi="Courier New" w:cs="Courier New"/>
           <w:sz w:val="20"/>
           <w:szCs w:val="20"/>
-        </w:rPr>
-        <w:t>time_features</w:t>
+          <w:highlight w:val="cyan"/>
+        </w:rPr>
+        <w:t>FeaturePipeline</w:t>
       </w:r>
       <w:proofErr w:type="spellEnd"/>
     </w:p>
@@ -1960,123 +2661,131 @@
           <w:rFonts w:ascii="Courier New" w:eastAsia="Times New Roman" w:hAnsi="Courier New" w:cs="Courier New"/>
           <w:sz w:val="20"/>
           <w:szCs w:val="20"/>
-        </w:rPr>
-      </w:pPr>
-      <w:r>
-        <w:rPr>
-          <w:rFonts w:ascii="Courier New" w:eastAsia="Times New Roman" w:hAnsi="Courier New" w:cs="Courier New"/>
-          <w:sz w:val="20"/>
-          <w:szCs w:val="20"/>
-        </w:rPr>
-        <w:t>│      ├── time_feature_engine.py</w:t>
-      </w:r>
-    </w:p>
-    <w:p>
-      <w:pPr>
-        <w:tabs>
-          <w:tab w:val="left" w:pos="916"/>
-          <w:tab w:val="left" w:pos="1832"/>
-          <w:tab w:val="left" w:pos="2748"/>
-          <w:tab w:val="left" w:pos="3664"/>
-          <w:tab w:val="left" w:pos="4580"/>
-          <w:tab w:val="left" w:pos="5496"/>
-          <w:tab w:val="left" w:pos="6412"/>
-          <w:tab w:val="left" w:pos="7328"/>
-          <w:tab w:val="left" w:pos="8244"/>
-          <w:tab w:val="left" w:pos="9160"/>
-          <w:tab w:val="left" w:pos="10076"/>
-          <w:tab w:val="left" w:pos="10992"/>
-          <w:tab w:val="left" w:pos="11908"/>
-          <w:tab w:val="left" w:pos="12824"/>
-          <w:tab w:val="left" w:pos="13740"/>
-          <w:tab w:val="left" w:pos="14656"/>
-        </w:tabs>
-        <w:spacing w:after="0" w:line="240" w:lineRule="auto"/>
-        <w:rPr>
-          <w:rFonts w:ascii="Courier New" w:eastAsia="Times New Roman" w:hAnsi="Courier New" w:cs="Courier New"/>
-          <w:sz w:val="20"/>
-          <w:szCs w:val="20"/>
-        </w:rPr>
-      </w:pPr>
-      <w:r>
-        <w:rPr>
-          <w:rFonts w:ascii="Courier New" w:eastAsia="Times New Roman" w:hAnsi="Courier New" w:cs="Courier New"/>
-          <w:sz w:val="20"/>
-          <w:szCs w:val="20"/>
-        </w:rPr>
-        <w:t>│      └── time_feature_functions.py</w:t>
-      </w:r>
-    </w:p>
-    <w:p>
-      <w:pPr>
-        <w:tabs>
-          <w:tab w:val="left" w:pos="916"/>
-          <w:tab w:val="left" w:pos="1832"/>
-          <w:tab w:val="left" w:pos="2748"/>
-          <w:tab w:val="left" w:pos="3664"/>
-          <w:tab w:val="left" w:pos="4580"/>
-          <w:tab w:val="left" w:pos="5496"/>
-          <w:tab w:val="left" w:pos="6412"/>
-          <w:tab w:val="left" w:pos="7328"/>
-          <w:tab w:val="left" w:pos="8244"/>
-          <w:tab w:val="left" w:pos="9160"/>
-          <w:tab w:val="left" w:pos="10076"/>
-          <w:tab w:val="left" w:pos="10992"/>
-          <w:tab w:val="left" w:pos="11908"/>
-          <w:tab w:val="left" w:pos="12824"/>
-          <w:tab w:val="left" w:pos="13740"/>
-          <w:tab w:val="left" w:pos="14656"/>
-        </w:tabs>
-        <w:spacing w:after="0" w:line="240" w:lineRule="auto"/>
-        <w:rPr>
-          <w:rFonts w:ascii="Courier New" w:eastAsia="Times New Roman" w:hAnsi="Courier New" w:cs="Courier New"/>
-          <w:sz w:val="20"/>
-          <w:szCs w:val="20"/>
-        </w:rPr>
-      </w:pPr>
-      <w:r>
-        <w:rPr>
-          <w:rFonts w:ascii="Courier New" w:eastAsia="Times New Roman" w:hAnsi="Courier New" w:cs="Courier New"/>
-          <w:sz w:val="20"/>
-          <w:szCs w:val="20"/>
-        </w:rPr>
-        <w:t>│</w:t>
-      </w:r>
-    </w:p>
-    <w:p>
-      <w:pPr>
-        <w:tabs>
-          <w:tab w:val="left" w:pos="916"/>
-          <w:tab w:val="left" w:pos="1832"/>
-          <w:tab w:val="left" w:pos="2748"/>
-          <w:tab w:val="left" w:pos="3664"/>
-          <w:tab w:val="left" w:pos="4580"/>
-          <w:tab w:val="left" w:pos="5496"/>
-          <w:tab w:val="left" w:pos="6412"/>
-          <w:tab w:val="left" w:pos="7328"/>
-          <w:tab w:val="left" w:pos="8244"/>
-          <w:tab w:val="left" w:pos="9160"/>
-          <w:tab w:val="left" w:pos="10076"/>
-          <w:tab w:val="left" w:pos="10992"/>
-          <w:tab w:val="left" w:pos="11908"/>
-          <w:tab w:val="left" w:pos="12824"/>
-          <w:tab w:val="left" w:pos="13740"/>
-          <w:tab w:val="left" w:pos="14656"/>
-        </w:tabs>
-        <w:spacing w:after="0" w:line="240" w:lineRule="auto"/>
-        <w:rPr>
-          <w:rFonts w:ascii="Courier New" w:eastAsia="Times New Roman" w:hAnsi="Courier New" w:cs="Courier New"/>
-          <w:sz w:val="20"/>
-          <w:szCs w:val="20"/>
-        </w:rPr>
-      </w:pPr>
-      <w:r>
-        <w:rPr>
-          <w:rFonts w:ascii="Courier New" w:eastAsia="Times New Roman" w:hAnsi="Courier New" w:cs="Courier New"/>
-          <w:sz w:val="20"/>
-          <w:szCs w:val="20"/>
-        </w:rPr>
-        <w:t xml:space="preserve">├── </w:t>
+          <w:highlight w:val="cyan"/>
+        </w:rPr>
+      </w:pPr>
+      <w:r>
+        <w:rPr>
+          <w:rFonts w:ascii="Courier New" w:eastAsia="Times New Roman" w:hAnsi="Courier New" w:cs="Courier New"/>
+          <w:sz w:val="20"/>
+          <w:szCs w:val="20"/>
+          <w:highlight w:val="cyan"/>
+        </w:rPr>
+        <w:t xml:space="preserve">    |</w:t>
+      </w:r>
+    </w:p>
+    <w:p>
+      <w:pPr>
+        <w:tabs>
+          <w:tab w:val="left" w:pos="916"/>
+          <w:tab w:val="left" w:pos="1832"/>
+          <w:tab w:val="left" w:pos="2748"/>
+          <w:tab w:val="left" w:pos="3664"/>
+          <w:tab w:val="left" w:pos="4580"/>
+          <w:tab w:val="left" w:pos="5496"/>
+          <w:tab w:val="left" w:pos="6412"/>
+          <w:tab w:val="left" w:pos="7328"/>
+          <w:tab w:val="left" w:pos="8244"/>
+          <w:tab w:val="left" w:pos="9160"/>
+          <w:tab w:val="left" w:pos="10076"/>
+          <w:tab w:val="left" w:pos="10992"/>
+          <w:tab w:val="left" w:pos="11908"/>
+          <w:tab w:val="left" w:pos="12824"/>
+          <w:tab w:val="left" w:pos="13740"/>
+          <w:tab w:val="left" w:pos="14656"/>
+        </w:tabs>
+        <w:spacing w:after="0" w:line="240" w:lineRule="auto"/>
+        <w:rPr>
+          <w:rFonts w:ascii="Courier New" w:eastAsia="Times New Roman" w:hAnsi="Courier New" w:cs="Courier New"/>
+          <w:sz w:val="20"/>
+          <w:szCs w:val="20"/>
+          <w:highlight w:val="cyan"/>
+        </w:rPr>
+      </w:pPr>
+      <w:r>
+        <w:rPr>
+          <w:rFonts w:ascii="Courier New" w:eastAsia="Times New Roman" w:hAnsi="Courier New" w:cs="Courier New"/>
+          <w:sz w:val="20"/>
+          <w:szCs w:val="20"/>
+          <w:highlight w:val="cyan"/>
+        </w:rPr>
+        <w:t xml:space="preserve">    +----------------+</w:t>
+      </w:r>
+    </w:p>
+    <w:p>
+      <w:pPr>
+        <w:tabs>
+          <w:tab w:val="left" w:pos="916"/>
+          <w:tab w:val="left" w:pos="1832"/>
+          <w:tab w:val="left" w:pos="2748"/>
+          <w:tab w:val="left" w:pos="3664"/>
+          <w:tab w:val="left" w:pos="4580"/>
+          <w:tab w:val="left" w:pos="5496"/>
+          <w:tab w:val="left" w:pos="6412"/>
+          <w:tab w:val="left" w:pos="7328"/>
+          <w:tab w:val="left" w:pos="8244"/>
+          <w:tab w:val="left" w:pos="9160"/>
+          <w:tab w:val="left" w:pos="10076"/>
+          <w:tab w:val="left" w:pos="10992"/>
+          <w:tab w:val="left" w:pos="11908"/>
+          <w:tab w:val="left" w:pos="12824"/>
+          <w:tab w:val="left" w:pos="13740"/>
+          <w:tab w:val="left" w:pos="14656"/>
+        </w:tabs>
+        <w:spacing w:after="0" w:line="240" w:lineRule="auto"/>
+        <w:rPr>
+          <w:rFonts w:ascii="Courier New" w:eastAsia="Times New Roman" w:hAnsi="Courier New" w:cs="Courier New"/>
+          <w:sz w:val="20"/>
+          <w:szCs w:val="20"/>
+          <w:highlight w:val="cyan"/>
+        </w:rPr>
+      </w:pPr>
+      <w:r>
+        <w:rPr>
+          <w:rFonts w:ascii="Courier New" w:eastAsia="Times New Roman" w:hAnsi="Courier New" w:cs="Courier New"/>
+          <w:sz w:val="20"/>
+          <w:szCs w:val="20"/>
+          <w:highlight w:val="cyan"/>
+        </w:rPr>
+        <w:t xml:space="preserve">    |                |</w:t>
+      </w:r>
+    </w:p>
+    <w:p>
+      <w:pPr>
+        <w:tabs>
+          <w:tab w:val="left" w:pos="916"/>
+          <w:tab w:val="left" w:pos="1832"/>
+          <w:tab w:val="left" w:pos="2748"/>
+          <w:tab w:val="left" w:pos="3664"/>
+          <w:tab w:val="left" w:pos="4580"/>
+          <w:tab w:val="left" w:pos="5496"/>
+          <w:tab w:val="left" w:pos="6412"/>
+          <w:tab w:val="left" w:pos="7328"/>
+          <w:tab w:val="left" w:pos="8244"/>
+          <w:tab w:val="left" w:pos="9160"/>
+          <w:tab w:val="left" w:pos="10076"/>
+          <w:tab w:val="left" w:pos="10992"/>
+          <w:tab w:val="left" w:pos="11908"/>
+          <w:tab w:val="left" w:pos="12824"/>
+          <w:tab w:val="left" w:pos="13740"/>
+          <w:tab w:val="left" w:pos="14656"/>
+        </w:tabs>
+        <w:spacing w:after="0" w:line="240" w:lineRule="auto"/>
+        <w:rPr>
+          <w:rFonts w:ascii="Courier New" w:eastAsia="Times New Roman" w:hAnsi="Courier New" w:cs="Courier New"/>
+          <w:sz w:val="20"/>
+          <w:szCs w:val="20"/>
+          <w:highlight w:val="cyan"/>
+        </w:rPr>
+      </w:pPr>
+      <w:r>
+        <w:rPr>
+          <w:rFonts w:ascii="Courier New" w:eastAsia="Times New Roman" w:hAnsi="Courier New" w:cs="Courier New"/>
+          <w:sz w:val="20"/>
+          <w:szCs w:val="20"/>
+          <w:highlight w:val="cyan"/>
+        </w:rPr>
+        <w:t xml:space="preserve">    v                </w:t>
       </w:r>
       <w:proofErr w:type="spellStart"/>
       <w:r>
@@ -2084,8 +2793,9 @@
           <w:rFonts w:ascii="Courier New" w:eastAsia="Times New Roman" w:hAnsi="Courier New" w:cs="Courier New"/>
           <w:sz w:val="20"/>
           <w:szCs w:val="20"/>
-        </w:rPr>
-        <w:t>feature_registry</w:t>
+          <w:highlight w:val="cyan"/>
+        </w:rPr>
+        <w:t>v</w:t>
       </w:r>
       <w:proofErr w:type="spellEnd"/>
     </w:p>
@@ -2114,61 +2824,28 @@
           <w:rFonts w:ascii="Courier New" w:eastAsia="Times New Roman" w:hAnsi="Courier New" w:cs="Courier New"/>
           <w:sz w:val="20"/>
           <w:szCs w:val="20"/>
-        </w:rPr>
-      </w:pPr>
-      <w:r>
-        <w:rPr>
-          <w:rFonts w:ascii="Courier New" w:eastAsia="Times New Roman" w:hAnsi="Courier New" w:cs="Courier New"/>
-          <w:sz w:val="20"/>
-          <w:szCs w:val="20"/>
-        </w:rPr>
-        <w:t xml:space="preserve">├── </w:t>
-      </w:r>
+          <w:highlight w:val="cyan"/>
+        </w:rPr>
+      </w:pPr>
       <w:proofErr w:type="spellStart"/>
       <w:r>
         <w:rPr>
           <w:rFonts w:ascii="Courier New" w:eastAsia="Times New Roman" w:hAnsi="Courier New" w:cs="Courier New"/>
           <w:sz w:val="20"/>
           <w:szCs w:val="20"/>
-        </w:rPr>
-        <w:t>feature_engine</w:t>
+          <w:highlight w:val="cyan"/>
+        </w:rPr>
+        <w:t>TimeFeatureEngine</w:t>
       </w:r>
       <w:proofErr w:type="spellEnd"/>
-    </w:p>
-    <w:p>
-      <w:pPr>
-        <w:tabs>
-          <w:tab w:val="left" w:pos="916"/>
-          <w:tab w:val="left" w:pos="1832"/>
-          <w:tab w:val="left" w:pos="2748"/>
-          <w:tab w:val="left" w:pos="3664"/>
-          <w:tab w:val="left" w:pos="4580"/>
-          <w:tab w:val="left" w:pos="5496"/>
-          <w:tab w:val="left" w:pos="6412"/>
-          <w:tab w:val="left" w:pos="7328"/>
-          <w:tab w:val="left" w:pos="8244"/>
-          <w:tab w:val="left" w:pos="9160"/>
-          <w:tab w:val="left" w:pos="10076"/>
-          <w:tab w:val="left" w:pos="10992"/>
-          <w:tab w:val="left" w:pos="11908"/>
-          <w:tab w:val="left" w:pos="12824"/>
-          <w:tab w:val="left" w:pos="13740"/>
-          <w:tab w:val="left" w:pos="14656"/>
-        </w:tabs>
-        <w:spacing w:after="0" w:line="240" w:lineRule="auto"/>
-        <w:rPr>
-          <w:rFonts w:ascii="Courier New" w:eastAsia="Times New Roman" w:hAnsi="Courier New" w:cs="Courier New"/>
-          <w:sz w:val="20"/>
-          <w:szCs w:val="20"/>
-        </w:rPr>
-      </w:pPr>
-      <w:r>
-        <w:rPr>
-          <w:rFonts w:ascii="Courier New" w:eastAsia="Times New Roman" w:hAnsi="Courier New" w:cs="Courier New"/>
-          <w:sz w:val="20"/>
-          <w:szCs w:val="20"/>
-        </w:rPr>
-        <w:t xml:space="preserve">├── </w:t>
+      <w:r>
+        <w:rPr>
+          <w:rFonts w:ascii="Courier New" w:eastAsia="Times New Roman" w:hAnsi="Courier New" w:cs="Courier New"/>
+          <w:sz w:val="20"/>
+          <w:szCs w:val="20"/>
+          <w:highlight w:val="cyan"/>
+        </w:rPr>
+        <w:t xml:space="preserve">   </w:t>
       </w:r>
       <w:proofErr w:type="spellStart"/>
       <w:r>
@@ -2176,8 +2853,9 @@
           <w:rFonts w:ascii="Courier New" w:eastAsia="Times New Roman" w:hAnsi="Courier New" w:cs="Courier New"/>
           <w:sz w:val="20"/>
           <w:szCs w:val="20"/>
-        </w:rPr>
-        <w:t>feature_pipeline</w:t>
+          <w:highlight w:val="cyan"/>
+        </w:rPr>
+        <w:t>FeatureEngine</w:t>
       </w:r>
       <w:proofErr w:type="spellEnd"/>
     </w:p>
@@ -2206,824 +2884,223 @@
           <w:rFonts w:ascii="Courier New" w:eastAsia="Times New Roman" w:hAnsi="Courier New" w:cs="Courier New"/>
           <w:sz w:val="20"/>
           <w:szCs w:val="20"/>
-        </w:rPr>
-      </w:pPr>
-      <w:r>
-        <w:rPr>
-          <w:rFonts w:ascii="Courier New" w:eastAsia="Times New Roman" w:hAnsi="Courier New" w:cs="Courier New"/>
-          <w:sz w:val="20"/>
-          <w:szCs w:val="20"/>
-        </w:rPr>
-        <w:t xml:space="preserve">├── </w:t>
-      </w:r>
+          <w:highlight w:val="cyan"/>
+        </w:rPr>
+      </w:pPr>
+      <w:r>
+        <w:rPr>
+          <w:rFonts w:ascii="Courier New" w:eastAsia="Times New Roman" w:hAnsi="Courier New" w:cs="Courier New"/>
+          <w:sz w:val="20"/>
+          <w:szCs w:val="20"/>
+          <w:highlight w:val="cyan"/>
+        </w:rPr>
+        <w:t xml:space="preserve">                   |</w:t>
+      </w:r>
+    </w:p>
+    <w:p>
+      <w:pPr>
+        <w:tabs>
+          <w:tab w:val="left" w:pos="916"/>
+          <w:tab w:val="left" w:pos="1832"/>
+          <w:tab w:val="left" w:pos="2748"/>
+          <w:tab w:val="left" w:pos="3664"/>
+          <w:tab w:val="left" w:pos="4580"/>
+          <w:tab w:val="left" w:pos="5496"/>
+          <w:tab w:val="left" w:pos="6412"/>
+          <w:tab w:val="left" w:pos="7328"/>
+          <w:tab w:val="left" w:pos="8244"/>
+          <w:tab w:val="left" w:pos="9160"/>
+          <w:tab w:val="left" w:pos="10076"/>
+          <w:tab w:val="left" w:pos="10992"/>
+          <w:tab w:val="left" w:pos="11908"/>
+          <w:tab w:val="left" w:pos="12824"/>
+          <w:tab w:val="left" w:pos="13740"/>
+          <w:tab w:val="left" w:pos="14656"/>
+        </w:tabs>
+        <w:spacing w:after="0" w:line="240" w:lineRule="auto"/>
+        <w:rPr>
+          <w:rFonts w:ascii="Courier New" w:eastAsia="Times New Roman" w:hAnsi="Courier New" w:cs="Courier New"/>
+          <w:sz w:val="20"/>
+          <w:szCs w:val="20"/>
+          <w:highlight w:val="cyan"/>
+        </w:rPr>
+      </w:pPr>
+      <w:r>
+        <w:rPr>
+          <w:rFonts w:ascii="Courier New" w:eastAsia="Times New Roman" w:hAnsi="Courier New" w:cs="Courier New"/>
+          <w:sz w:val="20"/>
+          <w:szCs w:val="20"/>
+          <w:highlight w:val="cyan"/>
+        </w:rPr>
+        <w:t xml:space="preserve">                   v</w:t>
+      </w:r>
+    </w:p>
+    <w:p>
+      <w:pPr>
+        <w:tabs>
+          <w:tab w:val="left" w:pos="916"/>
+          <w:tab w:val="left" w:pos="1832"/>
+          <w:tab w:val="left" w:pos="2748"/>
+          <w:tab w:val="left" w:pos="3664"/>
+          <w:tab w:val="left" w:pos="4580"/>
+          <w:tab w:val="left" w:pos="5496"/>
+          <w:tab w:val="left" w:pos="6412"/>
+          <w:tab w:val="left" w:pos="7328"/>
+          <w:tab w:val="left" w:pos="8244"/>
+          <w:tab w:val="left" w:pos="9160"/>
+          <w:tab w:val="left" w:pos="10076"/>
+          <w:tab w:val="left" w:pos="10992"/>
+          <w:tab w:val="left" w:pos="11908"/>
+          <w:tab w:val="left" w:pos="12824"/>
+          <w:tab w:val="left" w:pos="13740"/>
+          <w:tab w:val="left" w:pos="14656"/>
+        </w:tabs>
+        <w:spacing w:after="0" w:line="240" w:lineRule="auto"/>
+        <w:rPr>
+          <w:rFonts w:ascii="Courier New" w:eastAsia="Times New Roman" w:hAnsi="Courier New" w:cs="Courier New"/>
+          <w:sz w:val="20"/>
+          <w:szCs w:val="20"/>
+          <w:highlight w:val="cyan"/>
+        </w:rPr>
+      </w:pPr>
+      <w:r>
+        <w:rPr>
+          <w:rFonts w:ascii="Courier New" w:eastAsia="Times New Roman" w:hAnsi="Courier New" w:cs="Courier New"/>
+          <w:sz w:val="20"/>
+          <w:szCs w:val="20"/>
+          <w:highlight w:val="cyan"/>
+        </w:rPr>
+        <w:t xml:space="preserve">              Indicators</w:t>
+      </w:r>
+    </w:p>
+    <w:p>
+      <w:pPr>
+        <w:tabs>
+          <w:tab w:val="left" w:pos="916"/>
+          <w:tab w:val="left" w:pos="1832"/>
+          <w:tab w:val="left" w:pos="2748"/>
+          <w:tab w:val="left" w:pos="3664"/>
+          <w:tab w:val="left" w:pos="4580"/>
+          <w:tab w:val="left" w:pos="5496"/>
+          <w:tab w:val="left" w:pos="6412"/>
+          <w:tab w:val="left" w:pos="7328"/>
+          <w:tab w:val="left" w:pos="8244"/>
+          <w:tab w:val="left" w:pos="9160"/>
+          <w:tab w:val="left" w:pos="10076"/>
+          <w:tab w:val="left" w:pos="10992"/>
+          <w:tab w:val="left" w:pos="11908"/>
+          <w:tab w:val="left" w:pos="12824"/>
+          <w:tab w:val="left" w:pos="13740"/>
+          <w:tab w:val="left" w:pos="14656"/>
+        </w:tabs>
+        <w:spacing w:after="0" w:line="240" w:lineRule="auto"/>
+        <w:rPr>
+          <w:rFonts w:ascii="Courier New" w:eastAsia="Times New Roman" w:hAnsi="Courier New" w:cs="Courier New"/>
+          <w:sz w:val="20"/>
+          <w:szCs w:val="20"/>
+          <w:highlight w:val="cyan"/>
+        </w:rPr>
+      </w:pPr>
+      <w:r>
+        <w:rPr>
+          <w:rFonts w:ascii="Courier New" w:eastAsia="Times New Roman" w:hAnsi="Courier New" w:cs="Courier New"/>
+          <w:sz w:val="20"/>
+          <w:szCs w:val="20"/>
+          <w:highlight w:val="cyan"/>
+        </w:rPr>
+        <w:t xml:space="preserve">    |</w:t>
+      </w:r>
+    </w:p>
+    <w:p>
+      <w:pPr>
+        <w:tabs>
+          <w:tab w:val="left" w:pos="916"/>
+          <w:tab w:val="left" w:pos="1832"/>
+          <w:tab w:val="left" w:pos="2748"/>
+          <w:tab w:val="left" w:pos="3664"/>
+          <w:tab w:val="left" w:pos="4580"/>
+          <w:tab w:val="left" w:pos="5496"/>
+          <w:tab w:val="left" w:pos="6412"/>
+          <w:tab w:val="left" w:pos="7328"/>
+          <w:tab w:val="left" w:pos="8244"/>
+          <w:tab w:val="left" w:pos="9160"/>
+          <w:tab w:val="left" w:pos="10076"/>
+          <w:tab w:val="left" w:pos="10992"/>
+          <w:tab w:val="left" w:pos="11908"/>
+          <w:tab w:val="left" w:pos="12824"/>
+          <w:tab w:val="left" w:pos="13740"/>
+          <w:tab w:val="left" w:pos="14656"/>
+        </w:tabs>
+        <w:spacing w:after="0" w:line="240" w:lineRule="auto"/>
+        <w:rPr>
+          <w:rFonts w:ascii="Courier New" w:eastAsia="Times New Roman" w:hAnsi="Courier New" w:cs="Courier New"/>
+          <w:sz w:val="20"/>
+          <w:szCs w:val="20"/>
+          <w:highlight w:val="cyan"/>
+        </w:rPr>
+      </w:pPr>
+      <w:r>
+        <w:rPr>
+          <w:rFonts w:ascii="Courier New" w:eastAsia="Times New Roman" w:hAnsi="Courier New" w:cs="Courier New"/>
+          <w:sz w:val="20"/>
+          <w:szCs w:val="20"/>
+          <w:highlight w:val="cyan"/>
+        </w:rPr>
+        <w:t xml:space="preserve">    v</w:t>
+      </w:r>
+    </w:p>
+    <w:p>
+      <w:pPr>
+        <w:tabs>
+          <w:tab w:val="left" w:pos="916"/>
+          <w:tab w:val="left" w:pos="1832"/>
+          <w:tab w:val="left" w:pos="2748"/>
+          <w:tab w:val="left" w:pos="3664"/>
+          <w:tab w:val="left" w:pos="4580"/>
+          <w:tab w:val="left" w:pos="5496"/>
+          <w:tab w:val="left" w:pos="6412"/>
+          <w:tab w:val="left" w:pos="7328"/>
+          <w:tab w:val="left" w:pos="8244"/>
+          <w:tab w:val="left" w:pos="9160"/>
+          <w:tab w:val="left" w:pos="10076"/>
+          <w:tab w:val="left" w:pos="10992"/>
+          <w:tab w:val="left" w:pos="11908"/>
+          <w:tab w:val="left" w:pos="12824"/>
+          <w:tab w:val="left" w:pos="13740"/>
+          <w:tab w:val="left" w:pos="14656"/>
+        </w:tabs>
+        <w:spacing w:after="0" w:line="240" w:lineRule="auto"/>
+        <w:rPr>
+          <w:rFonts w:ascii="Courier New" w:eastAsia="Times New Roman" w:hAnsi="Courier New" w:cs="Courier New"/>
+          <w:sz w:val="20"/>
+          <w:szCs w:val="20"/>
+        </w:rPr>
+      </w:pPr>
       <w:proofErr w:type="spellStart"/>
       <w:r>
         <w:rPr>
           <w:rFonts w:ascii="Courier New" w:eastAsia="Times New Roman" w:hAnsi="Courier New" w:cs="Courier New"/>
           <w:sz w:val="20"/>
           <w:szCs w:val="20"/>
-        </w:rPr>
-        <w:t>feature_store</w:t>
+          <w:highlight w:val="cyan"/>
+        </w:rPr>
+        <w:t>MTFDataset</w:t>
       </w:r>
       <w:proofErr w:type="spellEnd"/>
-    </w:p>
-    <w:p>
-      <w:pPr>
-        <w:tabs>
-          <w:tab w:val="left" w:pos="916"/>
-          <w:tab w:val="left" w:pos="1832"/>
-          <w:tab w:val="left" w:pos="2748"/>
-          <w:tab w:val="left" w:pos="3664"/>
-          <w:tab w:val="left" w:pos="4580"/>
-          <w:tab w:val="left" w:pos="5496"/>
-          <w:tab w:val="left" w:pos="6412"/>
-          <w:tab w:val="left" w:pos="7328"/>
-          <w:tab w:val="left" w:pos="8244"/>
-          <w:tab w:val="left" w:pos="9160"/>
-          <w:tab w:val="left" w:pos="10076"/>
-          <w:tab w:val="left" w:pos="10992"/>
-          <w:tab w:val="left" w:pos="11908"/>
-          <w:tab w:val="left" w:pos="12824"/>
-          <w:tab w:val="left" w:pos="13740"/>
-          <w:tab w:val="left" w:pos="14656"/>
-        </w:tabs>
-        <w:spacing w:after="0" w:line="240" w:lineRule="auto"/>
-        <w:rPr>
-          <w:rFonts w:ascii="Courier New" w:eastAsia="Times New Roman" w:hAnsi="Courier New" w:cs="Courier New"/>
-          <w:sz w:val="20"/>
-          <w:szCs w:val="20"/>
-        </w:rPr>
-      </w:pPr>
-      <w:r>
-        <w:rPr>
-          <w:rFonts w:ascii="Courier New" w:eastAsia="Times New Roman" w:hAnsi="Courier New" w:cs="Courier New"/>
-          <w:sz w:val="20"/>
-          <w:szCs w:val="20"/>
-        </w:rPr>
-        <w:t xml:space="preserve">├── </w:t>
-      </w:r>
-      <w:proofErr w:type="spellStart"/>
-      <w:r>
-        <w:rPr>
-          <w:rFonts w:ascii="Courier New" w:eastAsia="Times New Roman" w:hAnsi="Courier New" w:cs="Courier New"/>
-          <w:sz w:val="20"/>
-          <w:szCs w:val="20"/>
-        </w:rPr>
-        <w:t>observation_builder</w:t>
-      </w:r>
-      <w:proofErr w:type="spellEnd"/>
-    </w:p>
-    <w:p>
-      <w:pPr>
-        <w:tabs>
-          <w:tab w:val="left" w:pos="916"/>
-          <w:tab w:val="left" w:pos="1832"/>
-          <w:tab w:val="left" w:pos="2748"/>
-          <w:tab w:val="left" w:pos="3664"/>
-          <w:tab w:val="left" w:pos="4580"/>
-          <w:tab w:val="left" w:pos="5496"/>
-          <w:tab w:val="left" w:pos="6412"/>
-          <w:tab w:val="left" w:pos="7328"/>
-          <w:tab w:val="left" w:pos="8244"/>
-          <w:tab w:val="left" w:pos="9160"/>
-          <w:tab w:val="left" w:pos="10076"/>
-          <w:tab w:val="left" w:pos="10992"/>
-          <w:tab w:val="left" w:pos="11908"/>
-          <w:tab w:val="left" w:pos="12824"/>
-          <w:tab w:val="left" w:pos="13740"/>
-          <w:tab w:val="left" w:pos="14656"/>
-        </w:tabs>
-        <w:spacing w:after="0" w:line="240" w:lineRule="auto"/>
-        <w:rPr>
-          <w:rFonts w:ascii="Courier New" w:eastAsia="Times New Roman" w:hAnsi="Courier New" w:cs="Courier New"/>
-          <w:sz w:val="20"/>
-          <w:szCs w:val="20"/>
-        </w:rPr>
-      </w:pPr>
-      <w:r>
-        <w:rPr>
-          <w:rFonts w:ascii="Courier New" w:eastAsia="Times New Roman" w:hAnsi="Courier New" w:cs="Courier New"/>
-          <w:sz w:val="20"/>
-          <w:szCs w:val="20"/>
-        </w:rPr>
-        <w:t>...</w:t>
+      <w:r>
+        <w:rPr>
+          <w:rFonts w:ascii="Courier New" w:eastAsia="Times New Roman" w:hAnsi="Courier New" w:cs="Courier New"/>
+          <w:sz w:val="20"/>
+          <w:szCs w:val="20"/>
+          <w:highlight w:val="cyan"/>
+        </w:rPr>
+        <w:t xml:space="preserve"> + all features</w:t>
       </w:r>
     </w:p>
     <w:p>
       <w:pPr>
         <w:bidi/>
-        <w:spacing w:before="100" w:beforeAutospacing="1" w:after="100" w:afterAutospacing="1" w:line="240" w:lineRule="auto"/>
-        <w:rPr>
-          <w:rFonts w:ascii="Times New Roman" w:eastAsia="Times New Roman" w:hAnsi="Times New Roman" w:cs="Times New Roman"/>
-          <w:sz w:val="24"/>
-          <w:szCs w:val="24"/>
-        </w:rPr>
-      </w:pPr>
-      <w:r>
-        <w:rPr>
-          <w:rFonts w:ascii="Times New Roman" w:eastAsia="Times New Roman" w:hAnsi="Times New Roman" w:cs="Times New Roman"/>
-          <w:sz w:val="24"/>
-          <w:szCs w:val="24"/>
-          <w:rtl/>
-        </w:rPr>
-        <w:t xml:space="preserve">و بعد </w:t>
-      </w:r>
-      <w:proofErr w:type="spellStart"/>
-      <w:r>
-        <w:rPr>
-          <w:rFonts w:ascii="Courier New" w:eastAsia="Times New Roman" w:hAnsi="Courier New" w:cs="Courier New"/>
-          <w:sz w:val="20"/>
-          <w:szCs w:val="20"/>
-        </w:rPr>
-        <w:t>FeatureEngine</w:t>
-      </w:r>
-      <w:proofErr w:type="spellEnd"/>
-      <w:r>
-        <w:rPr>
-          <w:rFonts w:ascii="Times New Roman" w:eastAsia="Times New Roman" w:hAnsi="Times New Roman" w:cs="Times New Roman"/>
-          <w:sz w:val="24"/>
-          <w:szCs w:val="24"/>
-        </w:rPr>
-        <w:t xml:space="preserve"> </w:t>
-      </w:r>
-      <w:r>
-        <w:rPr>
-          <w:rFonts w:ascii="Times New Roman" w:eastAsia="Times New Roman" w:hAnsi="Times New Roman" w:cs="Times New Roman"/>
-          <w:sz w:val="24"/>
-          <w:szCs w:val="24"/>
-          <w:rtl/>
-        </w:rPr>
-        <w:t xml:space="preserve">یا </w:t>
-      </w:r>
-      <w:proofErr w:type="spellStart"/>
-      <w:r>
-        <w:rPr>
-          <w:rFonts w:ascii="Courier New" w:eastAsia="Times New Roman" w:hAnsi="Courier New" w:cs="Courier New"/>
-          <w:sz w:val="20"/>
-          <w:szCs w:val="20"/>
-        </w:rPr>
-        <w:t>FeaturePipeline</w:t>
-      </w:r>
-      <w:proofErr w:type="spellEnd"/>
-      <w:r>
-        <w:rPr>
-          <w:rFonts w:ascii="Times New Roman" w:eastAsia="Times New Roman" w:hAnsi="Times New Roman" w:cs="Times New Roman"/>
-          <w:sz w:val="24"/>
-          <w:szCs w:val="24"/>
-        </w:rPr>
-        <w:t xml:space="preserve"> </w:t>
-      </w:r>
-      <w:r>
-        <w:rPr>
-          <w:rFonts w:ascii="Times New Roman" w:eastAsia="Times New Roman" w:hAnsi="Times New Roman" w:cs="Times New Roman"/>
-          <w:sz w:val="24"/>
-          <w:szCs w:val="24"/>
-          <w:rtl/>
-        </w:rPr>
-        <w:t>تصمیم بگیرد که این</w:t>
-      </w:r>
-      <w:r>
-        <w:rPr>
-          <w:rFonts w:ascii="Times New Roman" w:eastAsia="Times New Roman" w:hAnsi="Times New Roman" w:cs="Times New Roman"/>
-          <w:sz w:val="24"/>
-          <w:szCs w:val="24"/>
-        </w:rPr>
-        <w:t xml:space="preserve"> feature</w:t>
-      </w:r>
-      <w:r>
-        <w:rPr>
-          <w:rFonts w:ascii="Times New Roman" w:eastAsia="Times New Roman" w:hAnsi="Times New Roman" w:cs="Times New Roman"/>
-          <w:sz w:val="24"/>
-          <w:szCs w:val="24"/>
-          <w:rtl/>
-        </w:rPr>
-        <w:t>ها را هم به خروجی اضافه کند</w:t>
-      </w:r>
-      <w:r>
-        <w:rPr>
-          <w:rFonts w:ascii="Times New Roman" w:eastAsia="Times New Roman" w:hAnsi="Times New Roman" w:cs="Times New Roman"/>
-          <w:sz w:val="24"/>
-          <w:szCs w:val="24"/>
-        </w:rPr>
-        <w:t>.</w:t>
-      </w:r>
-    </w:p>
-    <w:p>
-      <w:pPr>
-        <w:bidi/>
-        <w:spacing w:before="100" w:beforeAutospacing="1" w:after="100" w:afterAutospacing="1" w:line="240" w:lineRule="auto"/>
-        <w:rPr>
-          <w:rFonts w:ascii="Times New Roman" w:eastAsia="Times New Roman" w:hAnsi="Times New Roman" w:cs="Times New Roman"/>
-          <w:sz w:val="24"/>
-          <w:szCs w:val="24"/>
-        </w:rPr>
-      </w:pPr>
-      <w:r>
-        <w:rPr>
-          <w:rFonts w:ascii="Times New Roman" w:eastAsia="Times New Roman" w:hAnsi="Times New Roman" w:cs="Times New Roman"/>
-          <w:sz w:val="24"/>
-          <w:szCs w:val="24"/>
-          <w:rtl/>
-        </w:rPr>
-        <w:t>یعنی مسیر</w:t>
-      </w:r>
-      <w:r>
-        <w:rPr>
-          <w:rFonts w:ascii="Times New Roman" w:eastAsia="Times New Roman" w:hAnsi="Times New Roman" w:cs="Times New Roman"/>
-          <w:sz w:val="24"/>
-          <w:szCs w:val="24"/>
-        </w:rPr>
-        <w:t>:</w:t>
-      </w:r>
-    </w:p>
-    <w:p>
-      <w:pPr>
-        <w:tabs>
-          <w:tab w:val="left" w:pos="916"/>
-          <w:tab w:val="left" w:pos="1832"/>
-          <w:tab w:val="left" w:pos="2748"/>
-          <w:tab w:val="left" w:pos="3664"/>
-          <w:tab w:val="left" w:pos="4580"/>
-          <w:tab w:val="left" w:pos="5496"/>
-          <w:tab w:val="left" w:pos="6412"/>
-          <w:tab w:val="left" w:pos="7328"/>
-          <w:tab w:val="left" w:pos="8244"/>
-          <w:tab w:val="left" w:pos="9160"/>
-          <w:tab w:val="left" w:pos="10076"/>
-          <w:tab w:val="left" w:pos="10992"/>
-          <w:tab w:val="left" w:pos="11908"/>
-          <w:tab w:val="left" w:pos="12824"/>
-          <w:tab w:val="left" w:pos="13740"/>
-          <w:tab w:val="left" w:pos="14656"/>
-        </w:tabs>
-        <w:spacing w:after="0" w:line="240" w:lineRule="auto"/>
-        <w:rPr>
-          <w:rFonts w:ascii="Courier New" w:eastAsia="Times New Roman" w:hAnsi="Courier New" w:cs="Courier New"/>
-          <w:sz w:val="20"/>
-          <w:szCs w:val="20"/>
-        </w:rPr>
-      </w:pPr>
-      <w:proofErr w:type="spellStart"/>
-      <w:r>
-        <w:rPr>
-          <w:rFonts w:ascii="Courier New" w:eastAsia="Times New Roman" w:hAnsi="Courier New" w:cs="Courier New"/>
-          <w:sz w:val="20"/>
-          <w:szCs w:val="20"/>
-        </w:rPr>
-        <w:t>MTFDataset</w:t>
-      </w:r>
-      <w:proofErr w:type="spellEnd"/>
-    </w:p>
-    <w:p>
-      <w:pPr>
-        <w:tabs>
-          <w:tab w:val="left" w:pos="916"/>
-          <w:tab w:val="left" w:pos="1832"/>
-          <w:tab w:val="left" w:pos="2748"/>
-          <w:tab w:val="left" w:pos="3664"/>
-          <w:tab w:val="left" w:pos="4580"/>
-          <w:tab w:val="left" w:pos="5496"/>
-          <w:tab w:val="left" w:pos="6412"/>
-          <w:tab w:val="left" w:pos="7328"/>
-          <w:tab w:val="left" w:pos="8244"/>
-          <w:tab w:val="left" w:pos="9160"/>
-          <w:tab w:val="left" w:pos="10076"/>
-          <w:tab w:val="left" w:pos="10992"/>
-          <w:tab w:val="left" w:pos="11908"/>
-          <w:tab w:val="left" w:pos="12824"/>
-          <w:tab w:val="left" w:pos="13740"/>
-          <w:tab w:val="left" w:pos="14656"/>
-        </w:tabs>
-        <w:spacing w:after="0" w:line="240" w:lineRule="auto"/>
-        <w:rPr>
-          <w:rFonts w:ascii="Courier New" w:eastAsia="Times New Roman" w:hAnsi="Courier New" w:cs="Courier New"/>
-          <w:sz w:val="20"/>
-          <w:szCs w:val="20"/>
-        </w:rPr>
-      </w:pPr>
-      <w:r>
-        <w:rPr>
-          <w:rFonts w:ascii="Courier New" w:eastAsia="Times New Roman" w:hAnsi="Courier New" w:cs="Courier New"/>
-          <w:sz w:val="20"/>
-          <w:szCs w:val="20"/>
-        </w:rPr>
-        <w:t xml:space="preserve">    |</w:t>
-      </w:r>
-    </w:p>
-    <w:p>
-      <w:pPr>
-        <w:tabs>
-          <w:tab w:val="left" w:pos="916"/>
-          <w:tab w:val="left" w:pos="1832"/>
-          <w:tab w:val="left" w:pos="2748"/>
-          <w:tab w:val="left" w:pos="3664"/>
-          <w:tab w:val="left" w:pos="4580"/>
-          <w:tab w:val="left" w:pos="5496"/>
-          <w:tab w:val="left" w:pos="6412"/>
-          <w:tab w:val="left" w:pos="7328"/>
-          <w:tab w:val="left" w:pos="8244"/>
-          <w:tab w:val="left" w:pos="9160"/>
-          <w:tab w:val="left" w:pos="10076"/>
-          <w:tab w:val="left" w:pos="10992"/>
-          <w:tab w:val="left" w:pos="11908"/>
-          <w:tab w:val="left" w:pos="12824"/>
-          <w:tab w:val="left" w:pos="13740"/>
-          <w:tab w:val="left" w:pos="14656"/>
-        </w:tabs>
-        <w:spacing w:after="0" w:line="240" w:lineRule="auto"/>
-        <w:rPr>
-          <w:rFonts w:ascii="Courier New" w:eastAsia="Times New Roman" w:hAnsi="Courier New" w:cs="Courier New"/>
-          <w:sz w:val="20"/>
-          <w:szCs w:val="20"/>
-        </w:rPr>
-      </w:pPr>
-      <w:r>
-        <w:rPr>
-          <w:rFonts w:ascii="Courier New" w:eastAsia="Times New Roman" w:hAnsi="Courier New" w:cs="Courier New"/>
-          <w:sz w:val="20"/>
-          <w:szCs w:val="20"/>
-        </w:rPr>
-        <w:t xml:space="preserve">    v</w:t>
-      </w:r>
-    </w:p>
-    <w:p>
-      <w:pPr>
-        <w:tabs>
-          <w:tab w:val="left" w:pos="916"/>
-          <w:tab w:val="left" w:pos="1832"/>
-          <w:tab w:val="left" w:pos="2748"/>
-          <w:tab w:val="left" w:pos="3664"/>
-          <w:tab w:val="left" w:pos="4580"/>
-          <w:tab w:val="left" w:pos="5496"/>
-          <w:tab w:val="left" w:pos="6412"/>
-          <w:tab w:val="left" w:pos="7328"/>
-          <w:tab w:val="left" w:pos="8244"/>
-          <w:tab w:val="left" w:pos="9160"/>
-          <w:tab w:val="left" w:pos="10076"/>
-          <w:tab w:val="left" w:pos="10992"/>
-          <w:tab w:val="left" w:pos="11908"/>
-          <w:tab w:val="left" w:pos="12824"/>
-          <w:tab w:val="left" w:pos="13740"/>
-          <w:tab w:val="left" w:pos="14656"/>
-        </w:tabs>
-        <w:spacing w:after="0" w:line="240" w:lineRule="auto"/>
-        <w:rPr>
-          <w:rFonts w:ascii="Courier New" w:eastAsia="Times New Roman" w:hAnsi="Courier New" w:cs="Courier New"/>
-          <w:sz w:val="20"/>
-          <w:szCs w:val="20"/>
-        </w:rPr>
-      </w:pPr>
-      <w:proofErr w:type="spellStart"/>
-      <w:r>
-        <w:rPr>
-          <w:rFonts w:ascii="Courier New" w:eastAsia="Times New Roman" w:hAnsi="Courier New" w:cs="Courier New"/>
-          <w:sz w:val="20"/>
-          <w:szCs w:val="20"/>
-        </w:rPr>
-        <w:t>FeaturePipeline</w:t>
-      </w:r>
-      <w:proofErr w:type="spellEnd"/>
-    </w:p>
-    <w:p>
-      <w:pPr>
-        <w:tabs>
-          <w:tab w:val="left" w:pos="916"/>
-          <w:tab w:val="left" w:pos="1832"/>
-          <w:tab w:val="left" w:pos="2748"/>
-          <w:tab w:val="left" w:pos="3664"/>
-          <w:tab w:val="left" w:pos="4580"/>
-          <w:tab w:val="left" w:pos="5496"/>
-          <w:tab w:val="left" w:pos="6412"/>
-          <w:tab w:val="left" w:pos="7328"/>
-          <w:tab w:val="left" w:pos="8244"/>
-          <w:tab w:val="left" w:pos="9160"/>
-          <w:tab w:val="left" w:pos="10076"/>
-          <w:tab w:val="left" w:pos="10992"/>
-          <w:tab w:val="left" w:pos="11908"/>
-          <w:tab w:val="left" w:pos="12824"/>
-          <w:tab w:val="left" w:pos="13740"/>
-          <w:tab w:val="left" w:pos="14656"/>
-        </w:tabs>
-        <w:spacing w:after="0" w:line="240" w:lineRule="auto"/>
-        <w:rPr>
-          <w:rFonts w:ascii="Courier New" w:eastAsia="Times New Roman" w:hAnsi="Courier New" w:cs="Courier New"/>
-          <w:sz w:val="20"/>
-          <w:szCs w:val="20"/>
-        </w:rPr>
-      </w:pPr>
-      <w:r>
-        <w:rPr>
-          <w:rFonts w:ascii="Courier New" w:eastAsia="Times New Roman" w:hAnsi="Courier New" w:cs="Courier New"/>
-          <w:sz w:val="20"/>
-          <w:szCs w:val="20"/>
-        </w:rPr>
-        <w:t xml:space="preserve">    |</w:t>
-      </w:r>
-    </w:p>
-    <w:p>
-      <w:pPr>
-        <w:tabs>
-          <w:tab w:val="left" w:pos="916"/>
-          <w:tab w:val="left" w:pos="1832"/>
-          <w:tab w:val="left" w:pos="2748"/>
-          <w:tab w:val="left" w:pos="3664"/>
-          <w:tab w:val="left" w:pos="4580"/>
-          <w:tab w:val="left" w:pos="5496"/>
-          <w:tab w:val="left" w:pos="6412"/>
-          <w:tab w:val="left" w:pos="7328"/>
-          <w:tab w:val="left" w:pos="8244"/>
-          <w:tab w:val="left" w:pos="9160"/>
-          <w:tab w:val="left" w:pos="10076"/>
-          <w:tab w:val="left" w:pos="10992"/>
-          <w:tab w:val="left" w:pos="11908"/>
-          <w:tab w:val="left" w:pos="12824"/>
-          <w:tab w:val="left" w:pos="13740"/>
-          <w:tab w:val="left" w:pos="14656"/>
-        </w:tabs>
-        <w:spacing w:after="0" w:line="240" w:lineRule="auto"/>
-        <w:rPr>
-          <w:rFonts w:ascii="Courier New" w:eastAsia="Times New Roman" w:hAnsi="Courier New" w:cs="Courier New"/>
-          <w:sz w:val="20"/>
-          <w:szCs w:val="20"/>
-        </w:rPr>
-      </w:pPr>
-      <w:r>
-        <w:rPr>
-          <w:rFonts w:ascii="Courier New" w:eastAsia="Times New Roman" w:hAnsi="Courier New" w:cs="Courier New"/>
-          <w:sz w:val="20"/>
-          <w:szCs w:val="20"/>
-        </w:rPr>
-        <w:t xml:space="preserve">    +----------------+</w:t>
-      </w:r>
-    </w:p>
-    <w:p>
-      <w:pPr>
-        <w:tabs>
-          <w:tab w:val="left" w:pos="916"/>
-          <w:tab w:val="left" w:pos="1832"/>
-          <w:tab w:val="left" w:pos="2748"/>
-          <w:tab w:val="left" w:pos="3664"/>
-          <w:tab w:val="left" w:pos="4580"/>
-          <w:tab w:val="left" w:pos="5496"/>
-          <w:tab w:val="left" w:pos="6412"/>
-          <w:tab w:val="left" w:pos="7328"/>
-          <w:tab w:val="left" w:pos="8244"/>
-          <w:tab w:val="left" w:pos="9160"/>
-          <w:tab w:val="left" w:pos="10076"/>
-          <w:tab w:val="left" w:pos="10992"/>
-          <w:tab w:val="left" w:pos="11908"/>
-          <w:tab w:val="left" w:pos="12824"/>
-          <w:tab w:val="left" w:pos="13740"/>
-          <w:tab w:val="left" w:pos="14656"/>
-        </w:tabs>
-        <w:spacing w:after="0" w:line="240" w:lineRule="auto"/>
-        <w:rPr>
-          <w:rFonts w:ascii="Courier New" w:eastAsia="Times New Roman" w:hAnsi="Courier New" w:cs="Courier New"/>
-          <w:sz w:val="20"/>
-          <w:szCs w:val="20"/>
-        </w:rPr>
-      </w:pPr>
-      <w:r>
-        <w:rPr>
-          <w:rFonts w:ascii="Courier New" w:eastAsia="Times New Roman" w:hAnsi="Courier New" w:cs="Courier New"/>
-          <w:sz w:val="20"/>
-          <w:szCs w:val="20"/>
-        </w:rPr>
-        <w:t xml:space="preserve">    |                |</w:t>
-      </w:r>
-    </w:p>
-    <w:p>
-      <w:pPr>
-        <w:tabs>
-          <w:tab w:val="left" w:pos="916"/>
-          <w:tab w:val="left" w:pos="1832"/>
-          <w:tab w:val="left" w:pos="2748"/>
-          <w:tab w:val="left" w:pos="3664"/>
-          <w:tab w:val="left" w:pos="4580"/>
-          <w:tab w:val="left" w:pos="5496"/>
-          <w:tab w:val="left" w:pos="6412"/>
-          <w:tab w:val="left" w:pos="7328"/>
-          <w:tab w:val="left" w:pos="8244"/>
-          <w:tab w:val="left" w:pos="9160"/>
-          <w:tab w:val="left" w:pos="10076"/>
-          <w:tab w:val="left" w:pos="10992"/>
-          <w:tab w:val="left" w:pos="11908"/>
-          <w:tab w:val="left" w:pos="12824"/>
-          <w:tab w:val="left" w:pos="13740"/>
-          <w:tab w:val="left" w:pos="14656"/>
-        </w:tabs>
-        <w:spacing w:after="0" w:line="240" w:lineRule="auto"/>
-        <w:rPr>
-          <w:rFonts w:ascii="Courier New" w:eastAsia="Times New Roman" w:hAnsi="Courier New" w:cs="Courier New"/>
-          <w:sz w:val="20"/>
-          <w:szCs w:val="20"/>
-        </w:rPr>
-      </w:pPr>
-      <w:r>
-        <w:rPr>
-          <w:rFonts w:ascii="Courier New" w:eastAsia="Times New Roman" w:hAnsi="Courier New" w:cs="Courier New"/>
-          <w:sz w:val="20"/>
-          <w:szCs w:val="20"/>
-        </w:rPr>
-        <w:t xml:space="preserve">    v                </w:t>
-      </w:r>
-      <w:proofErr w:type="spellStart"/>
-      <w:r>
-        <w:rPr>
-          <w:rFonts w:ascii="Courier New" w:eastAsia="Times New Roman" w:hAnsi="Courier New" w:cs="Courier New"/>
-          <w:sz w:val="20"/>
-          <w:szCs w:val="20"/>
-        </w:rPr>
-        <w:t>v</w:t>
-      </w:r>
-      <w:proofErr w:type="spellEnd"/>
-    </w:p>
-    <w:p>
-      <w:pPr>
-        <w:tabs>
-          <w:tab w:val="left" w:pos="916"/>
-          <w:tab w:val="left" w:pos="1832"/>
-          <w:tab w:val="left" w:pos="2748"/>
-          <w:tab w:val="left" w:pos="3664"/>
-          <w:tab w:val="left" w:pos="4580"/>
-          <w:tab w:val="left" w:pos="5496"/>
-          <w:tab w:val="left" w:pos="6412"/>
-          <w:tab w:val="left" w:pos="7328"/>
-          <w:tab w:val="left" w:pos="8244"/>
-          <w:tab w:val="left" w:pos="9160"/>
-          <w:tab w:val="left" w:pos="10076"/>
-          <w:tab w:val="left" w:pos="10992"/>
-          <w:tab w:val="left" w:pos="11908"/>
-          <w:tab w:val="left" w:pos="12824"/>
-          <w:tab w:val="left" w:pos="13740"/>
-          <w:tab w:val="left" w:pos="14656"/>
-        </w:tabs>
-        <w:spacing w:after="0" w:line="240" w:lineRule="auto"/>
-        <w:rPr>
-          <w:rFonts w:ascii="Courier New" w:eastAsia="Times New Roman" w:hAnsi="Courier New" w:cs="Courier New"/>
-          <w:sz w:val="20"/>
-          <w:szCs w:val="20"/>
-        </w:rPr>
-      </w:pPr>
-      <w:proofErr w:type="spellStart"/>
-      <w:r>
-        <w:rPr>
-          <w:rFonts w:ascii="Courier New" w:eastAsia="Times New Roman" w:hAnsi="Courier New" w:cs="Courier New"/>
-          <w:sz w:val="20"/>
-          <w:szCs w:val="20"/>
-        </w:rPr>
-        <w:t>TimeFeatureEngine</w:t>
-      </w:r>
-      <w:proofErr w:type="spellEnd"/>
-      <w:r>
-        <w:rPr>
-          <w:rFonts w:ascii="Courier New" w:eastAsia="Times New Roman" w:hAnsi="Courier New" w:cs="Courier New"/>
-          <w:sz w:val="20"/>
-          <w:szCs w:val="20"/>
-        </w:rPr>
-        <w:t xml:space="preserve">   </w:t>
-      </w:r>
-      <w:proofErr w:type="spellStart"/>
-      <w:r>
-        <w:rPr>
-          <w:rFonts w:ascii="Courier New" w:eastAsia="Times New Roman" w:hAnsi="Courier New" w:cs="Courier New"/>
-          <w:sz w:val="20"/>
-          <w:szCs w:val="20"/>
-        </w:rPr>
-        <w:t>FeatureEngine</w:t>
-      </w:r>
-      <w:proofErr w:type="spellEnd"/>
-    </w:p>
-    <w:p>
-      <w:pPr>
-        <w:tabs>
-          <w:tab w:val="left" w:pos="916"/>
-          <w:tab w:val="left" w:pos="1832"/>
-          <w:tab w:val="left" w:pos="2748"/>
-          <w:tab w:val="left" w:pos="3664"/>
-          <w:tab w:val="left" w:pos="4580"/>
-          <w:tab w:val="left" w:pos="5496"/>
-          <w:tab w:val="left" w:pos="6412"/>
-          <w:tab w:val="left" w:pos="7328"/>
-          <w:tab w:val="left" w:pos="8244"/>
-          <w:tab w:val="left" w:pos="9160"/>
-          <w:tab w:val="left" w:pos="10076"/>
-          <w:tab w:val="left" w:pos="10992"/>
-          <w:tab w:val="left" w:pos="11908"/>
-          <w:tab w:val="left" w:pos="12824"/>
-          <w:tab w:val="left" w:pos="13740"/>
-          <w:tab w:val="left" w:pos="14656"/>
-        </w:tabs>
-        <w:spacing w:after="0" w:line="240" w:lineRule="auto"/>
-        <w:rPr>
-          <w:rFonts w:ascii="Courier New" w:eastAsia="Times New Roman" w:hAnsi="Courier New" w:cs="Courier New"/>
-          <w:sz w:val="20"/>
-          <w:szCs w:val="20"/>
-        </w:rPr>
-      </w:pPr>
-      <w:r>
-        <w:rPr>
-          <w:rFonts w:ascii="Courier New" w:eastAsia="Times New Roman" w:hAnsi="Courier New" w:cs="Courier New"/>
-          <w:sz w:val="20"/>
-          <w:szCs w:val="20"/>
-        </w:rPr>
-        <w:t xml:space="preserve">                   |</w:t>
-      </w:r>
-    </w:p>
-    <w:p>
-      <w:pPr>
-        <w:tabs>
-          <w:tab w:val="left" w:pos="916"/>
-          <w:tab w:val="left" w:pos="1832"/>
-          <w:tab w:val="left" w:pos="2748"/>
-          <w:tab w:val="left" w:pos="3664"/>
-          <w:tab w:val="left" w:pos="4580"/>
-          <w:tab w:val="left" w:pos="5496"/>
-          <w:tab w:val="left" w:pos="6412"/>
-          <w:tab w:val="left" w:pos="7328"/>
-          <w:tab w:val="left" w:pos="8244"/>
-          <w:tab w:val="left" w:pos="9160"/>
-          <w:tab w:val="left" w:pos="10076"/>
-          <w:tab w:val="left" w:pos="10992"/>
-          <w:tab w:val="left" w:pos="11908"/>
-          <w:tab w:val="left" w:pos="12824"/>
-          <w:tab w:val="left" w:pos="13740"/>
-          <w:tab w:val="left" w:pos="14656"/>
-        </w:tabs>
-        <w:spacing w:after="0" w:line="240" w:lineRule="auto"/>
-        <w:rPr>
-          <w:rFonts w:ascii="Courier New" w:eastAsia="Times New Roman" w:hAnsi="Courier New" w:cs="Courier New"/>
-          <w:sz w:val="20"/>
-          <w:szCs w:val="20"/>
-        </w:rPr>
-      </w:pPr>
-      <w:r>
-        <w:rPr>
-          <w:rFonts w:ascii="Courier New" w:eastAsia="Times New Roman" w:hAnsi="Courier New" w:cs="Courier New"/>
-          <w:sz w:val="20"/>
-          <w:szCs w:val="20"/>
-        </w:rPr>
-        <w:t xml:space="preserve">                   v</w:t>
-      </w:r>
-    </w:p>
-    <w:p>
-      <w:pPr>
-        <w:tabs>
-          <w:tab w:val="left" w:pos="916"/>
-          <w:tab w:val="left" w:pos="1832"/>
-          <w:tab w:val="left" w:pos="2748"/>
-          <w:tab w:val="left" w:pos="3664"/>
-          <w:tab w:val="left" w:pos="4580"/>
-          <w:tab w:val="left" w:pos="5496"/>
-          <w:tab w:val="left" w:pos="6412"/>
-          <w:tab w:val="left" w:pos="7328"/>
-          <w:tab w:val="left" w:pos="8244"/>
-          <w:tab w:val="left" w:pos="9160"/>
-          <w:tab w:val="left" w:pos="10076"/>
-          <w:tab w:val="left" w:pos="10992"/>
-          <w:tab w:val="left" w:pos="11908"/>
-          <w:tab w:val="left" w:pos="12824"/>
-          <w:tab w:val="left" w:pos="13740"/>
-          <w:tab w:val="left" w:pos="14656"/>
-        </w:tabs>
-        <w:spacing w:after="0" w:line="240" w:lineRule="auto"/>
-        <w:rPr>
-          <w:rFonts w:ascii="Courier New" w:eastAsia="Times New Roman" w:hAnsi="Courier New" w:cs="Courier New"/>
-          <w:sz w:val="20"/>
-          <w:szCs w:val="20"/>
-        </w:rPr>
-      </w:pPr>
-      <w:r>
-        <w:rPr>
-          <w:rFonts w:ascii="Courier New" w:eastAsia="Times New Roman" w:hAnsi="Courier New" w:cs="Courier New"/>
-          <w:sz w:val="20"/>
-          <w:szCs w:val="20"/>
-        </w:rPr>
-        <w:t xml:space="preserve">              Indicators</w:t>
-      </w:r>
-    </w:p>
-    <w:p>
-      <w:pPr>
-        <w:tabs>
-          <w:tab w:val="left" w:pos="916"/>
-          <w:tab w:val="left" w:pos="1832"/>
-          <w:tab w:val="left" w:pos="2748"/>
-          <w:tab w:val="left" w:pos="3664"/>
-          <w:tab w:val="left" w:pos="4580"/>
-          <w:tab w:val="left" w:pos="5496"/>
-          <w:tab w:val="left" w:pos="6412"/>
-          <w:tab w:val="left" w:pos="7328"/>
-          <w:tab w:val="left" w:pos="8244"/>
-          <w:tab w:val="left" w:pos="9160"/>
-          <w:tab w:val="left" w:pos="10076"/>
-          <w:tab w:val="left" w:pos="10992"/>
-          <w:tab w:val="left" w:pos="11908"/>
-          <w:tab w:val="left" w:pos="12824"/>
-          <w:tab w:val="left" w:pos="13740"/>
-          <w:tab w:val="left" w:pos="14656"/>
-        </w:tabs>
-        <w:spacing w:after="0" w:line="240" w:lineRule="auto"/>
-        <w:rPr>
-          <w:rFonts w:ascii="Courier New" w:eastAsia="Times New Roman" w:hAnsi="Courier New" w:cs="Courier New"/>
-          <w:sz w:val="20"/>
-          <w:szCs w:val="20"/>
-        </w:rPr>
-      </w:pPr>
-      <w:r>
-        <w:rPr>
-          <w:rFonts w:ascii="Courier New" w:eastAsia="Times New Roman" w:hAnsi="Courier New" w:cs="Courier New"/>
-          <w:sz w:val="20"/>
-          <w:szCs w:val="20"/>
-        </w:rPr>
-        <w:t xml:space="preserve">    |</w:t>
-      </w:r>
-    </w:p>
-    <w:p>
-      <w:pPr>
-        <w:tabs>
-          <w:tab w:val="left" w:pos="916"/>
-          <w:tab w:val="left" w:pos="1832"/>
-          <w:tab w:val="left" w:pos="2748"/>
-          <w:tab w:val="left" w:pos="3664"/>
-          <w:tab w:val="left" w:pos="4580"/>
-          <w:tab w:val="left" w:pos="5496"/>
-          <w:tab w:val="left" w:pos="6412"/>
-          <w:tab w:val="left" w:pos="7328"/>
-          <w:tab w:val="left" w:pos="8244"/>
-          <w:tab w:val="left" w:pos="9160"/>
-          <w:tab w:val="left" w:pos="10076"/>
-          <w:tab w:val="left" w:pos="10992"/>
-          <w:tab w:val="left" w:pos="11908"/>
-          <w:tab w:val="left" w:pos="12824"/>
-          <w:tab w:val="left" w:pos="13740"/>
-          <w:tab w:val="left" w:pos="14656"/>
-        </w:tabs>
-        <w:spacing w:after="0" w:line="240" w:lineRule="auto"/>
-        <w:rPr>
-          <w:rFonts w:ascii="Courier New" w:eastAsia="Times New Roman" w:hAnsi="Courier New" w:cs="Courier New"/>
-          <w:sz w:val="20"/>
-          <w:szCs w:val="20"/>
-        </w:rPr>
-      </w:pPr>
-      <w:r>
-        <w:rPr>
-          <w:rFonts w:ascii="Courier New" w:eastAsia="Times New Roman" w:hAnsi="Courier New" w:cs="Courier New"/>
-          <w:sz w:val="20"/>
-          <w:szCs w:val="20"/>
-        </w:rPr>
-        <w:t xml:space="preserve">    v</w:t>
-      </w:r>
-    </w:p>
-    <w:p>
-      <w:pPr>
-        <w:tabs>
-          <w:tab w:val="left" w:pos="916"/>
-          <w:tab w:val="left" w:pos="1832"/>
-          <w:tab w:val="left" w:pos="2748"/>
-          <w:tab w:val="left" w:pos="3664"/>
-          <w:tab w:val="left" w:pos="4580"/>
-          <w:tab w:val="left" w:pos="5496"/>
-          <w:tab w:val="left" w:pos="6412"/>
-          <w:tab w:val="left" w:pos="7328"/>
-          <w:tab w:val="left" w:pos="8244"/>
-          <w:tab w:val="left" w:pos="9160"/>
-          <w:tab w:val="left" w:pos="10076"/>
-          <w:tab w:val="left" w:pos="10992"/>
-          <w:tab w:val="left" w:pos="11908"/>
-          <w:tab w:val="left" w:pos="12824"/>
-          <w:tab w:val="left" w:pos="13740"/>
-          <w:tab w:val="left" w:pos="14656"/>
-        </w:tabs>
-        <w:spacing w:after="0" w:line="240" w:lineRule="auto"/>
-        <w:rPr>
-          <w:rFonts w:ascii="Courier New" w:eastAsia="Times New Roman" w:hAnsi="Courier New" w:cs="Courier New"/>
-          <w:sz w:val="20"/>
-          <w:szCs w:val="20"/>
-        </w:rPr>
-      </w:pPr>
-      <w:proofErr w:type="spellStart"/>
-      <w:r>
-        <w:rPr>
-          <w:rFonts w:ascii="Courier New" w:eastAsia="Times New Roman" w:hAnsi="Courier New" w:cs="Courier New"/>
-          <w:sz w:val="20"/>
-          <w:szCs w:val="20"/>
-        </w:rPr>
-        <w:t>MTFDataset</w:t>
-      </w:r>
-      <w:proofErr w:type="spellEnd"/>
-      <w:r>
-        <w:rPr>
-          <w:rFonts w:ascii="Courier New" w:eastAsia="Times New Roman" w:hAnsi="Courier New" w:cs="Courier New"/>
-          <w:sz w:val="20"/>
-          <w:szCs w:val="20"/>
-        </w:rPr>
-        <w:t xml:space="preserve"> + all features</w:t>
-      </w:r>
-    </w:p>
-    <w:p>
-      <w:pPr>
-        <w:bidi/>
-        <w:spacing w:before="100" w:beforeAutospacing="1" w:after="100" w:afterAutospacing="1" w:line="240" w:lineRule="auto"/>
+        <w:spacing w:after="0" w:line="240" w:lineRule="auto"/>
         <w:outlineLvl w:val="2"/>
         <w:rPr>
           <w:rFonts w:ascii="Times New Roman" w:eastAsia="Times New Roman" w:hAnsi="Times New Roman" w:cs="Times New Roman"/>
@@ -3058,7 +3135,7 @@
     <w:p>
       <w:pPr>
         <w:bidi/>
-        <w:spacing w:before="100" w:beforeAutospacing="1" w:after="100" w:afterAutospacing="1" w:line="240" w:lineRule="auto"/>
+        <w:spacing w:after="0" w:line="240" w:lineRule="auto"/>
         <w:rPr>
           <w:rFonts w:ascii="Times New Roman" w:eastAsia="Times New Roman" w:hAnsi="Times New Roman" w:cs="Times New Roman"/>
           <w:sz w:val="24"/>
@@ -3103,7 +3180,7 @@
     <w:p>
       <w:pPr>
         <w:bidi/>
-        <w:spacing w:before="100" w:beforeAutospacing="1" w:after="100" w:afterAutospacing="1" w:line="240" w:lineRule="auto"/>
+        <w:spacing w:after="0" w:line="240" w:lineRule="auto"/>
         <w:rPr>
           <w:rFonts w:ascii="Times New Roman" w:eastAsia="Times New Roman" w:hAnsi="Times New Roman" w:cs="Times New Roman"/>
           <w:sz w:val="24"/>
@@ -3135,7 +3212,7 @@
           <w:numId w:val="1"/>
         </w:numPr>
         <w:bidi/>
-        <w:spacing w:before="100" w:beforeAutospacing="1" w:after="100" w:afterAutospacing="1" w:line="240" w:lineRule="auto"/>
+        <w:spacing w:after="0" w:line="240" w:lineRule="auto"/>
         <w:rPr>
           <w:rFonts w:ascii="Times New Roman" w:eastAsia="Times New Roman" w:hAnsi="Times New Roman" w:cs="Times New Roman"/>
           <w:sz w:val="24"/>
@@ -3184,7 +3261,7 @@
           <w:numId w:val="1"/>
         </w:numPr>
         <w:bidi/>
-        <w:spacing w:before="100" w:beforeAutospacing="1" w:after="100" w:afterAutospacing="1" w:line="240" w:lineRule="auto"/>
+        <w:spacing w:after="0" w:line="240" w:lineRule="auto"/>
         <w:rPr>
           <w:rFonts w:ascii="Times New Roman" w:eastAsia="Times New Roman" w:hAnsi="Times New Roman" w:cs="Times New Roman"/>
           <w:sz w:val="24"/>
@@ -3237,7 +3314,7 @@
     <w:p>
       <w:pPr>
         <w:bidi/>
-        <w:spacing w:before="100" w:beforeAutospacing="1" w:after="100" w:afterAutospacing="1" w:line="240" w:lineRule="auto"/>
+        <w:spacing w:after="0" w:line="240" w:lineRule="auto"/>
         <w:rPr>
           <w:rFonts w:ascii="Times New Roman" w:eastAsia="Times New Roman" w:hAnsi="Times New Roman" w:cs="Times New Roman"/>
           <w:sz w:val="24"/>
@@ -3511,7 +3588,7 @@
     <w:p>
       <w:pPr>
         <w:bidi/>
-        <w:spacing w:before="100" w:beforeAutospacing="1" w:after="100" w:afterAutospacing="1" w:line="240" w:lineRule="auto"/>
+        <w:spacing w:after="0" w:line="240" w:lineRule="auto"/>
         <w:rPr>
           <w:rFonts w:ascii="Times New Roman" w:eastAsia="Times New Roman" w:hAnsi="Times New Roman" w:cs="Times New Roman"/>
           <w:sz w:val="24"/>
@@ -3577,7 +3654,7 @@
     <w:p>
       <w:pPr>
         <w:bidi/>
-        <w:spacing w:before="100" w:beforeAutospacing="1" w:after="100" w:afterAutospacing="1" w:line="240" w:lineRule="auto"/>
+        <w:spacing w:after="0" w:line="240" w:lineRule="auto"/>
         <w:rPr>
           <w:rFonts w:ascii="Times New Roman" w:eastAsia="Times New Roman" w:hAnsi="Times New Roman" w:cs="Times New Roman"/>
           <w:sz w:val="24"/>
@@ -3605,7 +3682,7 @@
     <w:p>
       <w:pPr>
         <w:bidi/>
-        <w:spacing w:beforeAutospacing="1" w:after="100" w:afterAutospacing="1" w:line="240" w:lineRule="auto"/>
+        <w:spacing w:after="0" w:line="240" w:lineRule="auto"/>
         <w:rPr>
           <w:rFonts w:ascii="Times New Roman" w:eastAsia="Times New Roman" w:hAnsi="Times New Roman" w:cs="Times New Roman"/>
           <w:sz w:val="24"/>
@@ -3642,7 +3719,7 @@
     <w:p>
       <w:pPr>
         <w:bidi/>
-        <w:spacing w:before="100" w:beforeAutospacing="1" w:after="100" w:afterAutospacing="1" w:line="240" w:lineRule="auto"/>
+        <w:spacing w:after="0" w:line="240" w:lineRule="auto"/>
         <w:rPr>
           <w:rFonts w:ascii="Times New Roman" w:eastAsia="Times New Roman" w:hAnsi="Times New Roman" w:cs="Times New Roman"/>
           <w:sz w:val="24"/>
@@ -3683,21 +3760,20 @@
     <w:p>
       <w:pPr>
         <w:bidi/>
-        <w:spacing w:beforeAutospacing="1" w:after="100" w:afterAutospacing="1" w:line="240" w:lineRule="auto"/>
-        <w:rPr>
-          <w:rFonts w:ascii="Times New Roman" w:eastAsia="Times New Roman" w:hAnsi="Times New Roman" w:cs="Times New Roman"/>
-          <w:sz w:val="24"/>
-          <w:szCs w:val="24"/>
-        </w:rPr>
-      </w:pPr>
-      <w:r>
-        <w:rPr>
-          <w:rFonts w:ascii="Times New Roman" w:eastAsia="Times New Roman" w:hAnsi="Times New Roman" w:cs="Times New Roman"/>
-          <w:sz w:val="24"/>
-          <w:szCs w:val="24"/>
-          <w:rtl/>
-        </w:rPr>
-        <w:lastRenderedPageBreak/>
+        <w:spacing w:after="0" w:line="240" w:lineRule="auto"/>
+        <w:rPr>
+          <w:rFonts w:ascii="Times New Roman" w:eastAsia="Times New Roman" w:hAnsi="Times New Roman" w:cs="Times New Roman"/>
+          <w:sz w:val="24"/>
+          <w:szCs w:val="24"/>
+        </w:rPr>
+      </w:pPr>
+      <w:r>
+        <w:rPr>
+          <w:rFonts w:ascii="Times New Roman" w:eastAsia="Times New Roman" w:hAnsi="Times New Roman" w:cs="Times New Roman"/>
+          <w:sz w:val="24"/>
+          <w:szCs w:val="24"/>
+          <w:rtl/>
+        </w:rPr>
         <w:t xml:space="preserve">یا ترجیح می‌دهی بیرون از آن پوشه و در یکی از </w:t>
       </w:r>
       <w:r>
@@ -3740,7 +3816,7 @@
     <w:p>
       <w:pPr>
         <w:bidi/>
-        <w:spacing w:before="100" w:beforeAutospacing="1" w:after="100" w:afterAutospacing="1" w:line="240" w:lineRule="auto"/>
+        <w:spacing w:after="0" w:line="240" w:lineRule="auto"/>
         <w:rPr>
           <w:rFonts w:ascii="Times New Roman" w:eastAsia="Times New Roman" w:hAnsi="Times New Roman" w:cs="Times New Roman"/>
           <w:sz w:val="24"/>
@@ -3825,7 +3901,7 @@
     <w:p>
       <w:pPr>
         <w:bidi/>
-        <w:spacing w:before="100" w:beforeAutospacing="1" w:after="100" w:afterAutospacing="1" w:line="240" w:lineRule="auto"/>
+        <w:spacing w:after="0" w:line="240" w:lineRule="auto"/>
         <w:rPr>
           <w:rFonts w:ascii="Times New Roman" w:eastAsia="Times New Roman" w:hAnsi="Times New Roman" w:cs="Times New Roman"/>
           <w:sz w:val="24"/>
@@ -3903,7 +3979,7 @@
           <w:numId w:val="2"/>
         </w:numPr>
         <w:bidi/>
-        <w:spacing w:before="100" w:beforeAutospacing="1" w:after="100" w:afterAutospacing="1" w:line="240" w:lineRule="auto"/>
+        <w:spacing w:after="0" w:line="240" w:lineRule="auto"/>
         <w:rPr>
           <w:rFonts w:ascii="Times New Roman" w:eastAsia="Times New Roman" w:hAnsi="Times New Roman" w:cs="Times New Roman"/>
           <w:sz w:val="24"/>
@@ -3926,7 +4002,7 @@
           <w:numId w:val="2"/>
         </w:numPr>
         <w:bidi/>
-        <w:spacing w:before="100" w:beforeAutospacing="1" w:after="100" w:afterAutospacing="1" w:line="240" w:lineRule="auto"/>
+        <w:spacing w:after="0" w:line="240" w:lineRule="auto"/>
         <w:rPr>
           <w:rFonts w:ascii="Times New Roman" w:eastAsia="Times New Roman" w:hAnsi="Times New Roman" w:cs="Times New Roman"/>
           <w:sz w:val="24"/>
@@ -3949,7 +4025,7 @@
           <w:numId w:val="2"/>
         </w:numPr>
         <w:bidi/>
-        <w:spacing w:before="100" w:beforeAutospacing="1" w:after="100" w:afterAutospacing="1" w:line="240" w:lineRule="auto"/>
+        <w:spacing w:after="0" w:line="240" w:lineRule="auto"/>
         <w:rPr>
           <w:rFonts w:ascii="Times New Roman" w:eastAsia="Times New Roman" w:hAnsi="Times New Roman" w:cs="Times New Roman"/>
           <w:sz w:val="24"/>
@@ -3972,7 +4048,7 @@
           <w:numId w:val="2"/>
         </w:numPr>
         <w:bidi/>
-        <w:spacing w:before="100" w:beforeAutospacing="1" w:after="100" w:afterAutospacing="1" w:line="240" w:lineRule="auto"/>
+        <w:spacing w:after="0" w:line="240" w:lineRule="auto"/>
         <w:rPr>
           <w:rFonts w:ascii="Times New Roman" w:eastAsia="Times New Roman" w:hAnsi="Times New Roman" w:cs="Times New Roman"/>
           <w:sz w:val="24"/>
@@ -3995,7 +4071,7 @@
           <w:numId w:val="2"/>
         </w:numPr>
         <w:bidi/>
-        <w:spacing w:before="100" w:beforeAutospacing="1" w:after="100" w:afterAutospacing="1" w:line="240" w:lineRule="auto"/>
+        <w:spacing w:after="0" w:line="240" w:lineRule="auto"/>
         <w:rPr>
           <w:rFonts w:ascii="Times New Roman" w:eastAsia="Times New Roman" w:hAnsi="Times New Roman" w:cs="Times New Roman"/>
           <w:sz w:val="24"/>
@@ -4018,7 +4094,7 @@
           <w:numId w:val="2"/>
         </w:numPr>
         <w:bidi/>
-        <w:spacing w:before="100" w:beforeAutospacing="1" w:after="100" w:afterAutospacing="1" w:line="240" w:lineRule="auto"/>
+        <w:spacing w:after="0" w:line="240" w:lineRule="auto"/>
         <w:rPr>
           <w:rFonts w:ascii="Times New Roman" w:eastAsia="Times New Roman" w:hAnsi="Times New Roman" w:cs="Times New Roman"/>
           <w:sz w:val="24"/>
@@ -4051,7 +4127,7 @@
           <w:numId w:val="2"/>
         </w:numPr>
         <w:bidi/>
-        <w:spacing w:before="100" w:beforeAutospacing="1" w:after="100" w:afterAutospacing="1" w:line="240" w:lineRule="auto"/>
+        <w:spacing w:after="0" w:line="240" w:lineRule="auto"/>
         <w:rPr>
           <w:rFonts w:ascii="Times New Roman" w:eastAsia="Times New Roman" w:hAnsi="Times New Roman" w:cs="Times New Roman"/>
           <w:sz w:val="24"/>
@@ -4074,7 +4150,7 @@
           <w:numId w:val="2"/>
         </w:numPr>
         <w:bidi/>
-        <w:spacing w:before="100" w:beforeAutospacing="1" w:after="100" w:afterAutospacing="1" w:line="240" w:lineRule="auto"/>
+        <w:spacing w:after="0" w:line="240" w:lineRule="auto"/>
         <w:rPr>
           <w:rFonts w:ascii="Times New Roman" w:eastAsia="Times New Roman" w:hAnsi="Times New Roman" w:cs="Times New Roman"/>
           <w:sz w:val="24"/>
@@ -4093,7 +4169,7 @@
     <w:p>
       <w:pPr>
         <w:bidi/>
-        <w:spacing w:before="100" w:beforeAutospacing="1" w:after="100" w:afterAutospacing="1" w:line="240" w:lineRule="auto"/>
+        <w:spacing w:after="0" w:line="240" w:lineRule="auto"/>
         <w:rPr>
           <w:rFonts w:ascii="Times New Roman" w:eastAsia="Times New Roman" w:hAnsi="Times New Roman" w:cs="Times New Roman"/>
           <w:sz w:val="24"/>
@@ -4121,7 +4197,7 @@
     <w:p>
       <w:pPr>
         <w:bidi/>
-        <w:spacing w:before="100" w:beforeAutospacing="1" w:after="100" w:afterAutospacing="1" w:line="240" w:lineRule="auto"/>
+        <w:spacing w:after="0" w:line="240" w:lineRule="auto"/>
         <w:rPr>
           <w:rFonts w:ascii="Times New Roman" w:eastAsia="Times New Roman" w:hAnsi="Times New Roman" w:cs="Times New Roman"/>
           <w:sz w:val="24"/>
@@ -4204,7 +4280,7 @@
     <w:p>
       <w:pPr>
         <w:bidi/>
-        <w:spacing w:before="100" w:beforeAutospacing="1" w:after="100" w:afterAutospacing="1" w:line="240" w:lineRule="auto"/>
+        <w:spacing w:after="0" w:line="240" w:lineRule="auto"/>
         <w:rPr>
           <w:rFonts w:ascii="Times New Roman" w:eastAsia="Times New Roman" w:hAnsi="Times New Roman" w:cs="Times New Roman"/>
           <w:sz w:val="24"/>
@@ -4347,7 +4423,7 @@
     <w:p>
       <w:pPr>
         <w:bidi/>
-        <w:spacing w:before="100" w:beforeAutospacing="1" w:after="100" w:afterAutospacing="1" w:line="240" w:lineRule="auto"/>
+        <w:spacing w:after="0" w:line="240" w:lineRule="auto"/>
         <w:rPr>
           <w:rFonts w:ascii="Times New Roman" w:eastAsia="Times New Roman" w:hAnsi="Times New Roman" w:cs="Times New Roman"/>
           <w:sz w:val="24"/>
@@ -4385,12 +4461,22 @@
       </w:pPr>
       <w:r>
         <w:rPr>
-          <w:rFonts w:ascii="Times New Roman" w:eastAsia="Times New Roman" w:hAnsi="Times New Roman" w:cs="Times New Roman"/>
+          <w:rFonts w:ascii="Times New Roman" w:eastAsia="Times New Roman" w:hAnsi="Times New Roman" w:cs="Times New Roman" w:hint="cs"/>
           <w:sz w:val="24"/>
           <w:szCs w:val="24"/>
           <w:highlight w:val="yellow"/>
           <w:rtl/>
         </w:rPr>
+        <w:t xml:space="preserve">من گفتم: </w:t>
+      </w:r>
+      <w:r>
+        <w:rPr>
+          <w:rFonts w:ascii="Times New Roman" w:eastAsia="Times New Roman" w:hAnsi="Times New Roman" w:cs="Times New Roman"/>
+          <w:sz w:val="24"/>
+          <w:szCs w:val="24"/>
+          <w:highlight w:val="yellow"/>
+          <w:rtl/>
+        </w:rPr>
         <w:t>در این پوشه چه فایلهایی باید قرار بگیرد؟ ورودی و خروجی به این لایه که من اسم آن را "لایه تایم فیچرز" میگذارم، چیست؟ هر فایل باید داری چه وظایفی باشد؟ هر فایل باید دارای چه توابع و یا کلاسهایی باشد؟قرار داد لایه تایم فیچرز را زودتر تعیین کن، تا زودتر کدنویسی ان را شروع کنیم</w:t>
       </w:r>
       <w:r>
@@ -4406,7 +4492,7 @@
     <w:p>
       <w:pPr>
         <w:bidi/>
-        <w:spacing w:before="100" w:beforeAutospacing="1" w:after="100" w:afterAutospacing="1" w:line="240" w:lineRule="auto"/>
+        <w:spacing w:after="0" w:line="240" w:lineRule="auto"/>
         <w:rPr>
           <w:rFonts w:ascii="Times New Roman" w:eastAsia="Times New Roman" w:hAnsi="Times New Roman" w:cs="Times New Roman"/>
           <w:sz w:val="24"/>
@@ -4557,7 +4643,7 @@
     <w:p>
       <w:pPr>
         <w:bidi/>
-        <w:spacing w:before="100" w:beforeAutospacing="1" w:after="100" w:afterAutospacing="1" w:line="240" w:lineRule="auto"/>
+        <w:spacing w:after="0" w:line="240" w:lineRule="auto"/>
         <w:rPr>
           <w:rFonts w:ascii="Times New Roman" w:eastAsia="Times New Roman" w:hAnsi="Times New Roman" w:cs="Times New Roman"/>
           <w:sz w:val="24"/>
@@ -4585,7 +4671,7 @@
     <w:p>
       <w:pPr>
         <w:bidi/>
-        <w:spacing w:before="100" w:beforeAutospacing="1" w:after="100" w:afterAutospacing="1" w:line="240" w:lineRule="auto"/>
+        <w:spacing w:after="0" w:line="240" w:lineRule="auto"/>
         <w:rPr>
           <w:rFonts w:ascii="Times New Roman" w:eastAsia="Times New Roman" w:hAnsi="Times New Roman" w:cs="Times New Roman"/>
           <w:sz w:val="24"/>
@@ -4659,20 +4745,21 @@
     <w:p>
       <w:pPr>
         <w:bidi/>
-        <w:spacing w:before="100" w:beforeAutospacing="1" w:after="100" w:afterAutospacing="1" w:line="240" w:lineRule="auto"/>
-        <w:rPr>
-          <w:rFonts w:ascii="Times New Roman" w:eastAsia="Times New Roman" w:hAnsi="Times New Roman" w:cs="Times New Roman"/>
-          <w:sz w:val="24"/>
-          <w:szCs w:val="24"/>
-        </w:rPr>
-      </w:pPr>
-      <w:r>
-        <w:rPr>
-          <w:rFonts w:ascii="Times New Roman" w:eastAsia="Times New Roman" w:hAnsi="Times New Roman" w:cs="Times New Roman"/>
-          <w:sz w:val="24"/>
-          <w:szCs w:val="24"/>
-          <w:rtl/>
-        </w:rPr>
+        <w:spacing w:after="0" w:line="240" w:lineRule="auto"/>
+        <w:rPr>
+          <w:rFonts w:ascii="Times New Roman" w:eastAsia="Times New Roman" w:hAnsi="Times New Roman" w:cs="Times New Roman"/>
+          <w:sz w:val="24"/>
+          <w:szCs w:val="24"/>
+        </w:rPr>
+      </w:pPr>
+      <w:r>
+        <w:rPr>
+          <w:rFonts w:ascii="Times New Roman" w:eastAsia="Times New Roman" w:hAnsi="Times New Roman" w:cs="Times New Roman"/>
+          <w:sz w:val="24"/>
+          <w:szCs w:val="24"/>
+          <w:rtl/>
+        </w:rPr>
+        <w:lastRenderedPageBreak/>
         <w:t>یعنی</w:t>
       </w:r>
       <w:r>
@@ -4691,7 +4778,7 @@
           <w:numId w:val="3"/>
         </w:numPr>
         <w:bidi/>
-        <w:spacing w:before="100" w:beforeAutospacing="1" w:after="100" w:afterAutospacing="1" w:line="240" w:lineRule="auto"/>
+        <w:spacing w:after="0" w:line="240" w:lineRule="auto"/>
         <w:rPr>
           <w:rFonts w:ascii="Times New Roman" w:eastAsia="Times New Roman" w:hAnsi="Times New Roman" w:cs="Times New Roman"/>
           <w:sz w:val="24"/>
@@ -4750,7 +4837,7 @@
           <w:numId w:val="3"/>
         </w:numPr>
         <w:bidi/>
-        <w:spacing w:before="100" w:beforeAutospacing="1" w:after="100" w:afterAutospacing="1" w:line="240" w:lineRule="auto"/>
+        <w:spacing w:after="0" w:line="240" w:lineRule="auto"/>
         <w:rPr>
           <w:rFonts w:ascii="Times New Roman" w:eastAsia="Times New Roman" w:hAnsi="Times New Roman" w:cs="Times New Roman"/>
           <w:sz w:val="24"/>
@@ -4853,7 +4940,7 @@
           <w:numId w:val="3"/>
         </w:numPr>
         <w:bidi/>
-        <w:spacing w:before="100" w:beforeAutospacing="1" w:after="100" w:afterAutospacing="1" w:line="240" w:lineRule="auto"/>
+        <w:spacing w:after="0" w:line="240" w:lineRule="auto"/>
         <w:rPr>
           <w:rFonts w:ascii="Times New Roman" w:eastAsia="Times New Roman" w:hAnsi="Times New Roman" w:cs="Times New Roman"/>
           <w:sz w:val="24"/>
@@ -4987,7 +5074,7 @@
     <w:p>
       <w:pPr>
         <w:bidi/>
-        <w:spacing w:before="100" w:beforeAutospacing="1" w:after="100" w:afterAutospacing="1" w:line="240" w:lineRule="auto"/>
+        <w:spacing w:after="0" w:line="240" w:lineRule="auto"/>
         <w:outlineLvl w:val="1"/>
         <w:rPr>
           <w:rFonts w:ascii="Times New Roman" w:eastAsia="Times New Roman" w:hAnsi="Times New Roman" w:cs="Times New Roman"/>
@@ -5022,7 +5109,7 @@
     <w:p>
       <w:pPr>
         <w:bidi/>
-        <w:spacing w:before="100" w:beforeAutospacing="1" w:after="100" w:afterAutospacing="1" w:line="240" w:lineRule="auto"/>
+        <w:spacing w:after="0" w:line="240" w:lineRule="auto"/>
         <w:rPr>
           <w:rFonts w:ascii="Times New Roman" w:eastAsia="Times New Roman" w:hAnsi="Times New Roman" w:cs="Times New Roman"/>
           <w:sz w:val="24"/>
@@ -5080,7 +5167,6 @@
           <w:sz w:val="20"/>
           <w:szCs w:val="20"/>
         </w:rPr>
-        <w:lastRenderedPageBreak/>
         <w:t>f03_features</w:t>
       </w:r>
     </w:p>
@@ -5776,7 +5862,7 @@
     <w:p>
       <w:pPr>
         <w:bidi/>
-        <w:spacing w:before="100" w:beforeAutospacing="1" w:after="100" w:afterAutospacing="1" w:line="240" w:lineRule="auto"/>
+        <w:spacing w:after="0" w:line="240" w:lineRule="auto"/>
         <w:outlineLvl w:val="0"/>
         <w:rPr>
           <w:rFonts w:ascii="Times New Roman" w:eastAsia="Times New Roman" w:hAnsi="Times New Roman" w:cs="Times New Roman"/>
@@ -5825,7 +5911,7 @@
     <w:p>
       <w:pPr>
         <w:bidi/>
-        <w:spacing w:before="100" w:beforeAutospacing="1" w:after="100" w:afterAutospacing="1" w:line="240" w:lineRule="auto"/>
+        <w:spacing w:after="0" w:line="240" w:lineRule="auto"/>
         <w:rPr>
           <w:rFonts w:ascii="Times New Roman" w:eastAsia="Times New Roman" w:hAnsi="Times New Roman" w:cs="Times New Roman"/>
           <w:sz w:val="24"/>
@@ -5892,7 +5978,7 @@
     <w:p>
       <w:pPr>
         <w:bidi/>
-        <w:spacing w:before="100" w:beforeAutospacing="1" w:after="100" w:afterAutospacing="1" w:line="240" w:lineRule="auto"/>
+        <w:spacing w:after="0" w:line="240" w:lineRule="auto"/>
         <w:rPr>
           <w:rFonts w:ascii="Times New Roman" w:eastAsia="Times New Roman" w:hAnsi="Times New Roman" w:cs="Times New Roman"/>
           <w:sz w:val="24"/>
@@ -6037,7 +6123,7 @@
     <w:p>
       <w:pPr>
         <w:bidi/>
-        <w:spacing w:before="100" w:beforeAutospacing="1" w:after="100" w:afterAutospacing="1" w:line="240" w:lineRule="auto"/>
+        <w:spacing w:after="0" w:line="240" w:lineRule="auto"/>
         <w:rPr>
           <w:rFonts w:ascii="Times New Roman" w:eastAsia="Times New Roman" w:hAnsi="Times New Roman" w:cs="Times New Roman"/>
           <w:sz w:val="24"/>
@@ -6403,7 +6489,7 @@
     <w:p>
       <w:pPr>
         <w:bidi/>
-        <w:spacing w:before="100" w:beforeAutospacing="1" w:after="100" w:afterAutospacing="1" w:line="240" w:lineRule="auto"/>
+        <w:spacing w:after="0" w:line="240" w:lineRule="auto"/>
         <w:rPr>
           <w:rFonts w:ascii="Times New Roman" w:eastAsia="Times New Roman" w:hAnsi="Times New Roman" w:cs="Times New Roman"/>
           <w:sz w:val="24"/>
@@ -6839,7 +6925,7 @@
     <w:p>
       <w:pPr>
         <w:bidi/>
-        <w:spacing w:before="100" w:beforeAutospacing="1" w:after="100" w:afterAutospacing="1" w:line="240" w:lineRule="auto"/>
+        <w:spacing w:after="0" w:line="240" w:lineRule="auto"/>
         <w:rPr>
           <w:rFonts w:ascii="Times New Roman" w:eastAsia="Times New Roman" w:hAnsi="Times New Roman" w:cs="Times New Roman"/>
           <w:sz w:val="24"/>
@@ -6915,7 +7001,6 @@
           <w:sz w:val="24"/>
           <w:szCs w:val="24"/>
         </w:rPr>
-        <w:lastRenderedPageBreak/>
         <w:pict>
           <v:rect id="_x0000_i1028" style="width:0;height:1.5pt" o:hralign="center" o:hrstd="t" o:hr="t" fillcolor="#a0a0a0" stroked="f"/>
         </w:pict>
@@ -6924,7 +7009,7 @@
     <w:p>
       <w:pPr>
         <w:bidi/>
-        <w:spacing w:before="100" w:beforeAutospacing="1" w:after="100" w:afterAutospacing="1" w:line="240" w:lineRule="auto"/>
+        <w:spacing w:after="0" w:line="240" w:lineRule="auto"/>
         <w:outlineLvl w:val="0"/>
         <w:rPr>
           <w:rFonts w:ascii="Times New Roman" w:eastAsia="Times New Roman" w:hAnsi="Times New Roman" w:cs="Times New Roman"/>
@@ -6944,6 +7029,7 @@
           <w:sz w:val="48"/>
           <w:szCs w:val="48"/>
         </w:rPr>
+        <w:lastRenderedPageBreak/>
         <w:t xml:space="preserve">3. </w:t>
       </w:r>
       <w:r>
@@ -6973,7 +7059,7 @@
     <w:p>
       <w:pPr>
         <w:bidi/>
-        <w:spacing w:before="100" w:beforeAutospacing="1" w:after="100" w:afterAutospacing="1" w:line="240" w:lineRule="auto"/>
+        <w:spacing w:after="0" w:line="240" w:lineRule="auto"/>
         <w:rPr>
           <w:rFonts w:ascii="Times New Roman" w:eastAsia="Times New Roman" w:hAnsi="Times New Roman" w:cs="Times New Roman"/>
           <w:sz w:val="24"/>
@@ -7001,7 +7087,7 @@
     <w:p>
       <w:pPr>
         <w:bidi/>
-        <w:spacing w:before="100" w:beforeAutospacing="1" w:after="100" w:afterAutospacing="1" w:line="240" w:lineRule="auto"/>
+        <w:spacing w:after="0" w:line="240" w:lineRule="auto"/>
         <w:rPr>
           <w:rFonts w:ascii="Times New Roman" w:eastAsia="Times New Roman" w:hAnsi="Times New Roman" w:cs="Times New Roman"/>
           <w:sz w:val="24"/>
@@ -7068,7 +7154,7 @@
     <w:p>
       <w:pPr>
         <w:bidi/>
-        <w:spacing w:before="100" w:beforeAutospacing="1" w:after="100" w:afterAutospacing="1" w:line="240" w:lineRule="auto"/>
+        <w:spacing w:after="0" w:line="240" w:lineRule="auto"/>
         <w:rPr>
           <w:rFonts w:ascii="Times New Roman" w:eastAsia="Times New Roman" w:hAnsi="Times New Roman" w:cs="Times New Roman"/>
           <w:sz w:val="24"/>
@@ -7096,7 +7182,7 @@
     <w:p>
       <w:pPr>
         <w:bidi/>
-        <w:spacing w:before="100" w:beforeAutospacing="1" w:after="100" w:afterAutospacing="1" w:line="240" w:lineRule="auto"/>
+        <w:spacing w:after="0" w:line="240" w:lineRule="auto"/>
         <w:rPr>
           <w:rFonts w:ascii="Times New Roman" w:eastAsia="Times New Roman" w:hAnsi="Times New Roman" w:cs="Times New Roman"/>
           <w:sz w:val="24"/>
@@ -7124,7 +7210,7 @@
     <w:p>
       <w:pPr>
         <w:bidi/>
-        <w:spacing w:before="100" w:beforeAutospacing="1" w:after="100" w:afterAutospacing="1" w:line="240" w:lineRule="auto"/>
+        <w:spacing w:after="0" w:line="240" w:lineRule="auto"/>
         <w:rPr>
           <w:rFonts w:ascii="Times New Roman" w:eastAsia="Times New Roman" w:hAnsi="Times New Roman" w:cs="Times New Roman"/>
           <w:sz w:val="24"/>
@@ -7487,7 +7573,7 @@
     <w:p>
       <w:pPr>
         <w:bidi/>
-        <w:spacing w:before="100" w:beforeAutospacing="1" w:after="100" w:afterAutospacing="1" w:line="240" w:lineRule="auto"/>
+        <w:spacing w:after="0" w:line="240" w:lineRule="auto"/>
         <w:rPr>
           <w:rFonts w:ascii="Times New Roman" w:eastAsia="Times New Roman" w:hAnsi="Times New Roman" w:cs="Times New Roman"/>
           <w:sz w:val="24"/>
@@ -8408,7 +8494,7 @@
     <w:p>
       <w:pPr>
         <w:bidi/>
-        <w:spacing w:before="100" w:beforeAutospacing="1" w:after="100" w:afterAutospacing="1" w:line="240" w:lineRule="auto"/>
+        <w:spacing w:after="0" w:line="240" w:lineRule="auto"/>
         <w:outlineLvl w:val="0"/>
         <w:rPr>
           <w:rFonts w:ascii="Times New Roman" w:eastAsia="Times New Roman" w:hAnsi="Times New Roman" w:cs="Times New Roman"/>
@@ -8446,7 +8532,7 @@
     <w:p>
       <w:pPr>
         <w:bidi/>
-        <w:spacing w:before="100" w:beforeAutospacing="1" w:after="100" w:afterAutospacing="1" w:line="240" w:lineRule="auto"/>
+        <w:spacing w:after="0" w:line="240" w:lineRule="auto"/>
         <w:outlineLvl w:val="1"/>
         <w:rPr>
           <w:rFonts w:ascii="Times New Roman" w:eastAsia="Times New Roman" w:hAnsi="Times New Roman" w:cs="Times New Roman"/>
@@ -8481,7 +8567,7 @@
     <w:p>
       <w:pPr>
         <w:bidi/>
-        <w:spacing w:before="100" w:beforeAutospacing="1" w:after="100" w:afterAutospacing="1" w:line="240" w:lineRule="auto"/>
+        <w:spacing w:after="0" w:line="240" w:lineRule="auto"/>
         <w:outlineLvl w:val="1"/>
         <w:rPr>
           <w:rFonts w:ascii="Times New Roman" w:eastAsia="Times New Roman" w:hAnsi="Times New Roman" w:cs="Times New Roman"/>
@@ -8500,14 +8586,13 @@
           <w:szCs w:val="28"/>
           <w:highlight w:val="magenta"/>
         </w:rPr>
-        <w:lastRenderedPageBreak/>
         <w:t>time_feature_contract.py</w:t>
       </w:r>
     </w:p>
     <w:p>
       <w:pPr>
         <w:bidi/>
-        <w:spacing w:before="100" w:beforeAutospacing="1" w:after="100" w:afterAutospacing="1" w:line="240" w:lineRule="auto"/>
+        <w:spacing w:after="0" w:line="240" w:lineRule="auto"/>
         <w:rPr>
           <w:rFonts w:ascii="Times New Roman" w:eastAsia="Times New Roman" w:hAnsi="Times New Roman" w:cs="Times New Roman"/>
           <w:sz w:val="24"/>
@@ -8535,7 +8620,7 @@
     <w:p>
       <w:pPr>
         <w:bidi/>
-        <w:spacing w:before="100" w:beforeAutospacing="1" w:after="100" w:afterAutospacing="1" w:line="240" w:lineRule="auto"/>
+        <w:spacing w:after="0" w:line="240" w:lineRule="auto"/>
         <w:rPr>
           <w:rFonts w:ascii="Times New Roman" w:eastAsia="Times New Roman" w:hAnsi="Times New Roman" w:cs="Times New Roman"/>
           <w:sz w:val="24"/>
@@ -8563,7 +8648,7 @@
     <w:p>
       <w:pPr>
         <w:bidi/>
-        <w:spacing w:before="100" w:beforeAutospacing="1" w:after="100" w:afterAutospacing="1" w:line="240" w:lineRule="auto"/>
+        <w:spacing w:after="0" w:line="240" w:lineRule="auto"/>
         <w:rPr>
           <w:rFonts w:ascii="Times New Roman" w:eastAsia="Times New Roman" w:hAnsi="Times New Roman" w:cs="Times New Roman"/>
           <w:sz w:val="24"/>
@@ -8591,7 +8676,7 @@
     <w:p>
       <w:pPr>
         <w:bidi/>
-        <w:spacing w:before="100" w:beforeAutospacing="1" w:after="100" w:afterAutospacing="1" w:line="240" w:lineRule="auto"/>
+        <w:spacing w:after="0" w:line="240" w:lineRule="auto"/>
         <w:rPr>
           <w:rFonts w:ascii="Times New Roman" w:eastAsia="Times New Roman" w:hAnsi="Times New Roman" w:cs="Times New Roman"/>
           <w:sz w:val="24"/>
@@ -8619,7 +8704,7 @@
     <w:p>
       <w:pPr>
         <w:bidi/>
-        <w:spacing w:before="100" w:beforeAutospacing="1" w:after="100" w:afterAutospacing="1" w:line="240" w:lineRule="auto"/>
+        <w:spacing w:after="0" w:line="240" w:lineRule="auto"/>
         <w:outlineLvl w:val="2"/>
         <w:rPr>
           <w:rFonts w:ascii="Times New Roman" w:eastAsia="Times New Roman" w:hAnsi="Times New Roman" w:cs="Times New Roman"/>
@@ -8762,7 +8847,7 @@
     <w:p>
       <w:pPr>
         <w:bidi/>
-        <w:spacing w:before="100" w:beforeAutospacing="1" w:after="100" w:afterAutospacing="1" w:line="240" w:lineRule="auto"/>
+        <w:spacing w:after="0" w:line="240" w:lineRule="auto"/>
         <w:rPr>
           <w:rFonts w:ascii="Times New Roman" w:eastAsia="Times New Roman" w:hAnsi="Times New Roman" w:cs="Times New Roman"/>
           <w:sz w:val="24"/>
@@ -9218,7 +9303,7 @@
     <w:p>
       <w:pPr>
         <w:bidi/>
-        <w:spacing w:before="100" w:beforeAutospacing="1" w:after="100" w:afterAutospacing="1" w:line="240" w:lineRule="auto"/>
+        <w:spacing w:after="0" w:line="240" w:lineRule="auto"/>
         <w:rPr>
           <w:rFonts w:ascii="Times New Roman" w:eastAsia="Times New Roman" w:hAnsi="Times New Roman" w:cs="Times New Roman"/>
           <w:sz w:val="24"/>
@@ -9439,7 +9524,7 @@
     <w:p>
       <w:pPr>
         <w:bidi/>
-        <w:spacing w:before="100" w:beforeAutospacing="1" w:after="100" w:afterAutospacing="1" w:line="240" w:lineRule="auto"/>
+        <w:spacing w:after="0" w:line="240" w:lineRule="auto"/>
         <w:rPr>
           <w:rFonts w:ascii="Times New Roman" w:eastAsia="Times New Roman" w:hAnsi="Times New Roman" w:cs="Times New Roman"/>
           <w:sz w:val="24"/>
@@ -9524,7 +9609,7 @@
     <w:p>
       <w:pPr>
         <w:bidi/>
-        <w:spacing w:before="100" w:beforeAutospacing="1" w:after="100" w:afterAutospacing="1" w:line="240" w:lineRule="auto"/>
+        <w:spacing w:after="0" w:line="240" w:lineRule="auto"/>
         <w:outlineLvl w:val="0"/>
         <w:rPr>
           <w:rFonts w:ascii="Times New Roman" w:eastAsia="Times New Roman" w:hAnsi="Times New Roman" w:cs="Times New Roman"/>
@@ -9562,7 +9647,7 @@
     <w:p>
       <w:pPr>
         <w:bidi/>
-        <w:spacing w:before="100" w:beforeAutospacing="1" w:after="100" w:afterAutospacing="1" w:line="240" w:lineRule="auto"/>
+        <w:spacing w:after="0" w:line="240" w:lineRule="auto"/>
         <w:outlineLvl w:val="0"/>
         <w:rPr>
           <w:rFonts w:ascii="Times New Roman" w:eastAsia="Times New Roman" w:hAnsi="Times New Roman" w:cs="Times New Roman"/>
@@ -9589,7 +9674,7 @@
     <w:p>
       <w:pPr>
         <w:bidi/>
-        <w:spacing w:before="100" w:beforeAutospacing="1" w:after="100" w:afterAutospacing="1" w:line="240" w:lineRule="auto"/>
+        <w:spacing w:after="0" w:line="240" w:lineRule="auto"/>
         <w:rPr>
           <w:rFonts w:ascii="Times New Roman" w:eastAsia="Times New Roman" w:hAnsi="Times New Roman" w:cs="Times New Roman"/>
           <w:sz w:val="24"/>
@@ -9634,7 +9719,7 @@
     <w:p>
       <w:pPr>
         <w:bidi/>
-        <w:spacing w:before="100" w:beforeAutospacing="1" w:after="100" w:afterAutospacing="1" w:line="240" w:lineRule="auto"/>
+        <w:spacing w:after="0" w:line="240" w:lineRule="auto"/>
         <w:rPr>
           <w:rFonts w:ascii="Times New Roman" w:eastAsia="Times New Roman" w:hAnsi="Times New Roman" w:cs="Times New Roman"/>
           <w:sz w:val="24"/>
@@ -9699,7 +9784,7 @@
     <w:p>
       <w:pPr>
         <w:bidi/>
-        <w:spacing w:before="100" w:beforeAutospacing="1" w:after="100" w:afterAutospacing="1" w:line="240" w:lineRule="auto"/>
+        <w:spacing w:after="0" w:line="240" w:lineRule="auto"/>
         <w:rPr>
           <w:rFonts w:ascii="Times New Roman" w:eastAsia="Times New Roman" w:hAnsi="Times New Roman" w:cs="Times New Roman"/>
           <w:sz w:val="24"/>
@@ -9727,7 +9812,7 @@
     <w:p>
       <w:pPr>
         <w:bidi/>
-        <w:spacing w:before="100" w:beforeAutospacing="1" w:after="100" w:afterAutospacing="1" w:line="240" w:lineRule="auto"/>
+        <w:spacing w:after="0" w:line="240" w:lineRule="auto"/>
         <w:rPr>
           <w:rFonts w:ascii="Times New Roman" w:eastAsia="Times New Roman" w:hAnsi="Times New Roman" w:cs="Times New Roman"/>
           <w:sz w:val="24"/>
@@ -9755,7 +9840,7 @@
     <w:p>
       <w:pPr>
         <w:bidi/>
-        <w:spacing w:before="100" w:beforeAutospacing="1" w:after="100" w:afterAutospacing="1" w:line="240" w:lineRule="auto"/>
+        <w:spacing w:after="0" w:line="240" w:lineRule="auto"/>
         <w:rPr>
           <w:rFonts w:ascii="Times New Roman" w:eastAsia="Times New Roman" w:hAnsi="Times New Roman" w:cs="Times New Roman"/>
           <w:sz w:val="24"/>
@@ -9814,7 +9899,6 @@
           <w:sz w:val="20"/>
           <w:szCs w:val="20"/>
         </w:rPr>
-        <w:lastRenderedPageBreak/>
         <w:t>def</w:t>
       </w:r>
       <w:proofErr w:type="spellEnd"/>
@@ -10373,7 +10457,7 @@
     <w:p>
       <w:pPr>
         <w:bidi/>
-        <w:spacing w:before="100" w:beforeAutospacing="1" w:after="100" w:afterAutospacing="1" w:line="240" w:lineRule="auto"/>
+        <w:spacing w:after="0" w:line="240" w:lineRule="auto"/>
         <w:rPr>
           <w:rFonts w:ascii="Times New Roman" w:eastAsia="Times New Roman" w:hAnsi="Times New Roman" w:cs="Times New Roman"/>
           <w:sz w:val="24"/>
@@ -10649,7 +10733,7 @@
     <w:p>
       <w:pPr>
         <w:bidi/>
-        <w:spacing w:before="100" w:beforeAutospacing="1" w:after="100" w:afterAutospacing="1" w:line="240" w:lineRule="auto"/>
+        <w:spacing w:after="0" w:line="240" w:lineRule="auto"/>
         <w:rPr>
           <w:rFonts w:ascii="Times New Roman" w:eastAsia="Times New Roman" w:hAnsi="Times New Roman" w:cs="Times New Roman"/>
           <w:sz w:val="24"/>
@@ -10677,7 +10761,7 @@
     <w:p>
       <w:pPr>
         <w:bidi/>
-        <w:spacing w:before="100" w:beforeAutospacing="1" w:after="100" w:afterAutospacing="1" w:line="240" w:lineRule="auto"/>
+        <w:spacing w:after="0" w:line="240" w:lineRule="auto"/>
         <w:rPr>
           <w:rFonts w:ascii="Times New Roman" w:eastAsia="Times New Roman" w:hAnsi="Times New Roman" w:cs="Times New Roman"/>
           <w:sz w:val="24"/>
@@ -10709,7 +10793,7 @@
           <w:numId w:val="4"/>
         </w:numPr>
         <w:bidi/>
-        <w:spacing w:before="100" w:beforeAutospacing="1" w:after="100" w:afterAutospacing="1" w:line="240" w:lineRule="auto"/>
+        <w:spacing w:after="0" w:line="240" w:lineRule="auto"/>
         <w:rPr>
           <w:rFonts w:ascii="Times New Roman" w:eastAsia="Times New Roman" w:hAnsi="Times New Roman" w:cs="Times New Roman"/>
           <w:sz w:val="24"/>
@@ -10759,7 +10843,7 @@
           <w:numId w:val="4"/>
         </w:numPr>
         <w:bidi/>
-        <w:spacing w:before="100" w:beforeAutospacing="1" w:after="100" w:afterAutospacing="1" w:line="240" w:lineRule="auto"/>
+        <w:spacing w:after="0" w:line="240" w:lineRule="auto"/>
         <w:rPr>
           <w:rFonts w:ascii="Times New Roman" w:eastAsia="Times New Roman" w:hAnsi="Times New Roman" w:cs="Times New Roman"/>
           <w:sz w:val="24"/>
@@ -10799,7 +10883,7 @@
           <w:numId w:val="4"/>
         </w:numPr>
         <w:bidi/>
-        <w:spacing w:before="100" w:beforeAutospacing="1" w:after="100" w:afterAutospacing="1" w:line="240" w:lineRule="auto"/>
+        <w:spacing w:after="0" w:line="240" w:lineRule="auto"/>
         <w:rPr>
           <w:rFonts w:ascii="Times New Roman" w:eastAsia="Times New Roman" w:hAnsi="Times New Roman" w:cs="Times New Roman"/>
           <w:sz w:val="24"/>
@@ -10835,7 +10919,7 @@
     <w:p>
       <w:pPr>
         <w:bidi/>
-        <w:spacing w:before="100" w:beforeAutospacing="1" w:after="100" w:afterAutospacing="1" w:line="240" w:lineRule="auto"/>
+        <w:spacing w:after="0" w:line="240" w:lineRule="auto"/>
         <w:rPr>
           <w:rFonts w:ascii="Times New Roman" w:eastAsia="Times New Roman" w:hAnsi="Times New Roman" w:cs="Times New Roman"/>
           <w:sz w:val="24"/>
@@ -10884,7 +10968,7 @@
     <w:p>
       <w:pPr>
         <w:bidi/>
-        <w:spacing w:before="100" w:beforeAutospacing="1" w:after="100" w:afterAutospacing="1" w:line="240" w:lineRule="auto"/>
+        <w:spacing w:after="0" w:line="240" w:lineRule="auto"/>
         <w:outlineLvl w:val="0"/>
         <w:rPr>
           <w:rFonts w:ascii="Times New Roman" w:eastAsia="Times New Roman" w:hAnsi="Times New Roman" w:cs="Times New Roman"/>
@@ -10922,7 +11006,7 @@
     <w:p>
       <w:pPr>
         <w:bidi/>
-        <w:spacing w:before="100" w:beforeAutospacing="1" w:after="100" w:afterAutospacing="1" w:line="240" w:lineRule="auto"/>
+        <w:spacing w:after="0" w:line="240" w:lineRule="auto"/>
         <w:outlineLvl w:val="0"/>
         <w:rPr>
           <w:rFonts w:ascii="Times New Roman" w:eastAsia="Times New Roman" w:hAnsi="Times New Roman" w:cs="Times New Roman"/>
@@ -10949,7 +11033,7 @@
     <w:p>
       <w:pPr>
         <w:bidi/>
-        <w:spacing w:before="100" w:beforeAutospacing="1" w:after="100" w:afterAutospacing="1" w:line="240" w:lineRule="auto"/>
+        <w:spacing w:after="0" w:line="240" w:lineRule="auto"/>
         <w:rPr>
           <w:rFonts w:ascii="Times New Roman" w:eastAsia="Times New Roman" w:hAnsi="Times New Roman" w:cs="Times New Roman"/>
           <w:sz w:val="24"/>
@@ -10977,7 +11061,7 @@
     <w:p>
       <w:pPr>
         <w:bidi/>
-        <w:spacing w:before="100" w:beforeAutospacing="1" w:after="100" w:afterAutospacing="1" w:line="240" w:lineRule="auto"/>
+        <w:spacing w:after="0" w:line="240" w:lineRule="auto"/>
         <w:rPr>
           <w:rFonts w:ascii="Times New Roman" w:eastAsia="Times New Roman" w:hAnsi="Times New Roman" w:cs="Times New Roman"/>
           <w:sz w:val="24"/>
@@ -11044,7 +11128,7 @@
     <w:p>
       <w:pPr>
         <w:bidi/>
-        <w:spacing w:before="100" w:beforeAutospacing="1" w:after="100" w:afterAutospacing="1" w:line="240" w:lineRule="auto"/>
+        <w:spacing w:after="0" w:line="240" w:lineRule="auto"/>
         <w:rPr>
           <w:rFonts w:ascii="Times New Roman" w:eastAsia="Times New Roman" w:hAnsi="Times New Roman" w:cs="Times New Roman"/>
           <w:sz w:val="24"/>
@@ -11072,7 +11156,7 @@
     <w:p>
       <w:pPr>
         <w:bidi/>
-        <w:spacing w:before="100" w:beforeAutospacing="1" w:after="100" w:afterAutospacing="1" w:line="240" w:lineRule="auto"/>
+        <w:spacing w:after="0" w:line="240" w:lineRule="auto"/>
         <w:rPr>
           <w:rFonts w:ascii="Times New Roman" w:eastAsia="Times New Roman" w:hAnsi="Times New Roman" w:cs="Times New Roman"/>
           <w:sz w:val="24"/>
@@ -11176,20 +11260,21 @@
     <w:p>
       <w:pPr>
         <w:bidi/>
-        <w:spacing w:before="100" w:beforeAutospacing="1" w:after="100" w:afterAutospacing="1" w:line="240" w:lineRule="auto"/>
-        <w:rPr>
-          <w:rFonts w:ascii="Times New Roman" w:eastAsia="Times New Roman" w:hAnsi="Times New Roman" w:cs="Times New Roman"/>
-          <w:sz w:val="24"/>
-          <w:szCs w:val="24"/>
-        </w:rPr>
-      </w:pPr>
-      <w:r>
-        <w:rPr>
-          <w:rFonts w:ascii="Times New Roman" w:eastAsia="Times New Roman" w:hAnsi="Times New Roman" w:cs="Times New Roman"/>
-          <w:sz w:val="24"/>
-          <w:szCs w:val="24"/>
-          <w:rtl/>
-        </w:rPr>
+        <w:spacing w:after="0" w:line="240" w:lineRule="auto"/>
+        <w:rPr>
+          <w:rFonts w:ascii="Times New Roman" w:eastAsia="Times New Roman" w:hAnsi="Times New Roman" w:cs="Times New Roman"/>
+          <w:sz w:val="24"/>
+          <w:szCs w:val="24"/>
+        </w:rPr>
+      </w:pPr>
+      <w:r>
+        <w:rPr>
+          <w:rFonts w:ascii="Times New Roman" w:eastAsia="Times New Roman" w:hAnsi="Times New Roman" w:cs="Times New Roman"/>
+          <w:sz w:val="24"/>
+          <w:szCs w:val="24"/>
+          <w:rtl/>
+        </w:rPr>
+        <w:lastRenderedPageBreak/>
         <w:t>وظایف</w:t>
       </w:r>
       <w:r>
@@ -11208,7 +11293,7 @@
           <w:numId w:val="5"/>
         </w:numPr>
         <w:bidi/>
-        <w:spacing w:before="100" w:beforeAutospacing="1" w:after="100" w:afterAutospacing="1" w:line="240" w:lineRule="auto"/>
+        <w:spacing w:after="0" w:line="240" w:lineRule="auto"/>
         <w:rPr>
           <w:rFonts w:ascii="Times New Roman" w:eastAsia="Times New Roman" w:hAnsi="Times New Roman" w:cs="Times New Roman"/>
           <w:sz w:val="24"/>
@@ -11258,7 +11343,7 @@
           <w:numId w:val="5"/>
         </w:numPr>
         <w:bidi/>
-        <w:spacing w:before="100" w:beforeAutospacing="1" w:after="100" w:afterAutospacing="1" w:line="240" w:lineRule="auto"/>
+        <w:spacing w:after="0" w:line="240" w:lineRule="auto"/>
         <w:rPr>
           <w:rFonts w:ascii="Times New Roman" w:eastAsia="Times New Roman" w:hAnsi="Times New Roman" w:cs="Times New Roman"/>
           <w:sz w:val="24"/>
@@ -11307,21 +11392,20 @@
           <w:numId w:val="5"/>
         </w:numPr>
         <w:bidi/>
-        <w:spacing w:before="100" w:beforeAutospacing="1" w:after="100" w:afterAutospacing="1" w:line="240" w:lineRule="auto"/>
-        <w:rPr>
-          <w:rFonts w:ascii="Times New Roman" w:eastAsia="Times New Roman" w:hAnsi="Times New Roman" w:cs="Times New Roman"/>
-          <w:sz w:val="24"/>
-          <w:szCs w:val="24"/>
-        </w:rPr>
-      </w:pPr>
-      <w:r>
-        <w:rPr>
-          <w:rFonts w:ascii="Times New Roman" w:eastAsia="Times New Roman" w:hAnsi="Times New Roman" w:cs="Times New Roman"/>
-          <w:sz w:val="24"/>
-          <w:szCs w:val="24"/>
-          <w:rtl/>
-        </w:rPr>
-        <w:lastRenderedPageBreak/>
+        <w:spacing w:after="0" w:line="240" w:lineRule="auto"/>
+        <w:rPr>
+          <w:rFonts w:ascii="Times New Roman" w:eastAsia="Times New Roman" w:hAnsi="Times New Roman" w:cs="Times New Roman"/>
+          <w:sz w:val="24"/>
+          <w:szCs w:val="24"/>
+        </w:rPr>
+      </w:pPr>
+      <w:r>
+        <w:rPr>
+          <w:rFonts w:ascii="Times New Roman" w:eastAsia="Times New Roman" w:hAnsi="Times New Roman" w:cs="Times New Roman"/>
+          <w:sz w:val="24"/>
+          <w:szCs w:val="24"/>
+          <w:rtl/>
+        </w:rPr>
         <w:t>برگرداندن</w:t>
       </w:r>
       <w:r>
@@ -11363,7 +11447,7 @@
     <w:p>
       <w:pPr>
         <w:bidi/>
-        <w:spacing w:before="100" w:beforeAutospacing="1" w:after="100" w:afterAutospacing="1" w:line="240" w:lineRule="auto"/>
+        <w:spacing w:after="0" w:line="240" w:lineRule="auto"/>
         <w:rPr>
           <w:rFonts w:ascii="Times New Roman" w:eastAsia="Times New Roman" w:hAnsi="Times New Roman" w:cs="Times New Roman"/>
           <w:sz w:val="24"/>
@@ -11656,7 +11740,7 @@
     <w:p>
       <w:pPr>
         <w:bidi/>
-        <w:spacing w:before="100" w:beforeAutospacing="1" w:after="100" w:afterAutospacing="1" w:line="240" w:lineRule="auto"/>
+        <w:spacing w:after="0" w:line="240" w:lineRule="auto"/>
         <w:rPr>
           <w:rFonts w:ascii="Times New Roman" w:eastAsia="Times New Roman" w:hAnsi="Times New Roman" w:cs="Times New Roman"/>
           <w:sz w:val="24"/>
@@ -11798,6 +11882,8 @@
         </w:rPr>
         <w:t xml:space="preserve">    [</w:t>
       </w:r>
+      <w:bookmarkStart w:id="0" w:name="_GoBack"/>
+      <w:bookmarkEnd w:id="0"/>
     </w:p>
     <w:p>
       <w:pPr>
@@ -12075,7 +12161,7 @@
     <w:p>
       <w:pPr>
         <w:bidi/>
-        <w:spacing w:before="100" w:beforeAutospacing="1" w:after="100" w:afterAutospacing="1" w:line="240" w:lineRule="auto"/>
+        <w:spacing w:after="0" w:line="240" w:lineRule="auto"/>
         <w:rPr>
           <w:rFonts w:ascii="Times New Roman" w:eastAsia="Times New Roman" w:hAnsi="Times New Roman" w:cs="Times New Roman"/>
           <w:sz w:val="24"/>
@@ -12550,7 +12636,7 @@
     <w:p>
       <w:pPr>
         <w:bidi/>
-        <w:spacing w:before="100" w:beforeAutospacing="1" w:after="100" w:afterAutospacing="1" w:line="240" w:lineRule="auto"/>
+        <w:spacing w:after="0" w:line="240" w:lineRule="auto"/>
         <w:outlineLvl w:val="0"/>
         <w:rPr>
           <w:rFonts w:ascii="Times New Roman" w:eastAsia="Times New Roman" w:hAnsi="Times New Roman" w:cs="Times New Roman"/>
@@ -12588,7 +12674,7 @@
     <w:p>
       <w:pPr>
         <w:bidi/>
-        <w:spacing w:before="100" w:beforeAutospacing="1" w:after="100" w:afterAutospacing="1" w:line="240" w:lineRule="auto"/>
+        <w:spacing w:after="0" w:line="240" w:lineRule="auto"/>
         <w:outlineLvl w:val="0"/>
         <w:rPr>
           <w:rFonts w:ascii="Times New Roman" w:eastAsia="Times New Roman" w:hAnsi="Times New Roman" w:cs="Times New Roman"/>
@@ -12615,7 +12701,7 @@
     <w:p>
       <w:pPr>
         <w:bidi/>
-        <w:spacing w:before="100" w:beforeAutospacing="1" w:after="100" w:afterAutospacing="1" w:line="240" w:lineRule="auto"/>
+        <w:spacing w:after="0" w:line="240" w:lineRule="auto"/>
         <w:rPr>
           <w:rFonts w:ascii="Times New Roman" w:eastAsia="Times New Roman" w:hAnsi="Times New Roman" w:cs="Times New Roman"/>
           <w:sz w:val="24"/>
@@ -12792,7 +12878,7 @@
     <w:p>
       <w:pPr>
         <w:bidi/>
-        <w:spacing w:before="100" w:beforeAutospacing="1" w:after="100" w:afterAutospacing="1" w:line="240" w:lineRule="auto"/>
+        <w:spacing w:after="0" w:line="240" w:lineRule="auto"/>
         <w:outlineLvl w:val="0"/>
         <w:rPr>
           <w:rFonts w:ascii="Times New Roman" w:eastAsia="Times New Roman" w:hAnsi="Times New Roman" w:cs="Times New Roman"/>
@@ -12830,7 +12916,7 @@
     <w:p>
       <w:pPr>
         <w:bidi/>
-        <w:spacing w:before="100" w:beforeAutospacing="1" w:after="100" w:afterAutospacing="1" w:line="240" w:lineRule="auto"/>
+        <w:spacing w:after="0" w:line="240" w:lineRule="auto"/>
         <w:rPr>
           <w:rFonts w:ascii="Times New Roman" w:eastAsia="Times New Roman" w:hAnsi="Times New Roman" w:cs="Times New Roman"/>
           <w:sz w:val="24"/>
@@ -12858,7 +12944,7 @@
     <w:p>
       <w:pPr>
         <w:bidi/>
-        <w:spacing w:before="100" w:beforeAutospacing="1" w:after="100" w:afterAutospacing="1" w:line="240" w:lineRule="auto"/>
+        <w:spacing w:after="0" w:line="240" w:lineRule="auto"/>
         <w:outlineLvl w:val="1"/>
         <w:rPr>
           <w:rFonts w:ascii="Times New Roman" w:eastAsia="Times New Roman" w:hAnsi="Times New Roman" w:cs="Times New Roman"/>
@@ -13128,7 +13214,6 @@
           <w:sz w:val="24"/>
           <w:szCs w:val="24"/>
         </w:rPr>
-        <w:lastRenderedPageBreak/>
         <w:pict>
           <v:rect id="_x0000_i1039" style="width:0;height:1.5pt" o:hralign="center" o:hrstd="t" o:hr="t" fillcolor="#a0a0a0" stroked="f"/>
         </w:pict>
@@ -13137,7 +13222,7 @@
     <w:p>
       <w:pPr>
         <w:bidi/>
-        <w:spacing w:before="100" w:beforeAutospacing="1" w:after="100" w:afterAutospacing="1" w:line="240" w:lineRule="auto"/>
+        <w:spacing w:after="0" w:line="240" w:lineRule="auto"/>
         <w:outlineLvl w:val="1"/>
         <w:rPr>
           <w:rFonts w:ascii="Times New Roman" w:eastAsia="Times New Roman" w:hAnsi="Times New Roman" w:cs="Times New Roman"/>
@@ -13303,7 +13388,7 @@
     <w:p>
       <w:pPr>
         <w:bidi/>
-        <w:spacing w:before="100" w:beforeAutospacing="1" w:after="100" w:afterAutospacing="1" w:line="240" w:lineRule="auto"/>
+        <w:spacing w:after="0" w:line="240" w:lineRule="auto"/>
         <w:outlineLvl w:val="1"/>
         <w:rPr>
           <w:rFonts w:ascii="Times New Roman" w:eastAsia="Times New Roman" w:hAnsi="Times New Roman" w:cs="Times New Roman"/>
@@ -13338,7 +13423,7 @@
     <w:p>
       <w:pPr>
         <w:bidi/>
-        <w:spacing w:before="100" w:beforeAutospacing="1" w:after="100" w:afterAutospacing="1" w:line="240" w:lineRule="auto"/>
+        <w:spacing w:after="0" w:line="240" w:lineRule="auto"/>
         <w:rPr>
           <w:rFonts w:ascii="Times New Roman" w:eastAsia="Times New Roman" w:hAnsi="Times New Roman" w:cs="Times New Roman"/>
           <w:sz w:val="24"/>
@@ -13501,6 +13586,7 @@
           <w:sz w:val="20"/>
           <w:szCs w:val="20"/>
         </w:rPr>
+        <w:lastRenderedPageBreak/>
         <w:t>day_sin</w:t>
       </w:r>
       <w:proofErr w:type="spellEnd"/>
@@ -13567,7 +13653,7 @@
     <w:p>
       <w:pPr>
         <w:bidi/>
-        <w:spacing w:before="100" w:beforeAutospacing="1" w:after="100" w:afterAutospacing="1" w:line="240" w:lineRule="auto"/>
+        <w:spacing w:after="0" w:line="240" w:lineRule="auto"/>
         <w:outlineLvl w:val="1"/>
         <w:rPr>
           <w:rFonts w:ascii="Times New Roman" w:eastAsia="Times New Roman" w:hAnsi="Times New Roman" w:cs="Times New Roman"/>
@@ -13591,7 +13677,7 @@
     <w:p>
       <w:pPr>
         <w:bidi/>
-        <w:spacing w:before="100" w:beforeAutospacing="1" w:after="100" w:afterAutospacing="1" w:line="240" w:lineRule="auto"/>
+        <w:spacing w:after="0" w:line="240" w:lineRule="auto"/>
         <w:rPr>
           <w:rFonts w:ascii="Times New Roman" w:eastAsia="Times New Roman" w:hAnsi="Times New Roman" w:cs="Times New Roman"/>
           <w:sz w:val="24"/>
@@ -13876,7 +13962,7 @@
     <w:p>
       <w:pPr>
         <w:bidi/>
-        <w:spacing w:before="100" w:beforeAutospacing="1" w:after="100" w:afterAutospacing="1" w:line="240" w:lineRule="auto"/>
+        <w:spacing w:after="0" w:line="240" w:lineRule="auto"/>
         <w:outlineLvl w:val="0"/>
         <w:rPr>
           <w:rFonts w:ascii="Times New Roman" w:eastAsia="Times New Roman" w:hAnsi="Times New Roman" w:cs="Times New Roman"/>
@@ -13938,7 +14024,7 @@
     <w:p>
       <w:pPr>
         <w:bidi/>
-        <w:spacing w:before="100" w:beforeAutospacing="1" w:after="100" w:afterAutospacing="1" w:line="240" w:lineRule="auto"/>
+        <w:spacing w:after="0" w:line="240" w:lineRule="auto"/>
         <w:rPr>
           <w:rFonts w:ascii="Times New Roman" w:eastAsia="Times New Roman" w:hAnsi="Times New Roman" w:cs="Times New Roman"/>
           <w:sz w:val="24"/>
@@ -14348,7 +14434,7 @@
     <w:p>
       <w:pPr>
         <w:bidi/>
-        <w:spacing w:before="100" w:beforeAutospacing="1" w:after="100" w:afterAutospacing="1" w:line="240" w:lineRule="auto"/>
+        <w:spacing w:after="0" w:line="240" w:lineRule="auto"/>
         <w:rPr>
           <w:rFonts w:ascii="Times New Roman" w:eastAsia="Times New Roman" w:hAnsi="Times New Roman" w:cs="Times New Roman"/>
           <w:sz w:val="24"/>
@@ -14680,7 +14766,6 @@
           <w:sz w:val="20"/>
           <w:szCs w:val="20"/>
         </w:rPr>
-        <w:lastRenderedPageBreak/>
         <w:t xml:space="preserve">        v</w:t>
       </w:r>
     </w:p>
@@ -14870,9 +14955,11 @@
         </w:tabs>
         <w:spacing w:after="0" w:line="240" w:lineRule="auto"/>
         <w:rPr>
-          <w:rFonts w:ascii="Courier New" w:eastAsia="Times New Roman" w:hAnsi="Courier New" w:cs="Courier New"/>
-          <w:sz w:val="20"/>
-          <w:szCs w:val="20"/>
+          <w:rFonts w:ascii="Courier New" w:eastAsia="Times New Roman" w:hAnsi="Courier New" w:cs="Courier New" w:hint="cs"/>
+          <w:sz w:val="20"/>
+          <w:szCs w:val="20"/>
+          <w:rtl/>
+          <w:lang w:bidi="fa-IR"/>
         </w:rPr>
       </w:pPr>
     </w:p>
@@ -15104,7 +15191,7 @@
     <w:p>
       <w:pPr>
         <w:bidi/>
-        <w:spacing w:before="100" w:beforeAutospacing="1" w:after="100" w:afterAutospacing="1" w:line="240" w:lineRule="auto"/>
+        <w:spacing w:after="0" w:line="240" w:lineRule="auto"/>
         <w:outlineLvl w:val="0"/>
         <w:rPr>
           <w:rFonts w:ascii="Times New Roman" w:eastAsia="Times New Roman" w:hAnsi="Times New Roman" w:cs="Times New Roman"/>
@@ -15188,7 +15275,7 @@
     <w:p>
       <w:pPr>
         <w:bidi/>
-        <w:spacing w:before="100" w:beforeAutospacing="1" w:after="100" w:afterAutospacing="1" w:line="240" w:lineRule="auto"/>
+        <w:spacing w:after="0" w:line="240" w:lineRule="auto"/>
         <w:rPr>
           <w:rFonts w:ascii="Times New Roman" w:eastAsia="Times New Roman" w:hAnsi="Times New Roman" w:cs="Times New Roman"/>
           <w:sz w:val="24"/>
@@ -15216,7 +15303,7 @@
     <w:p>
       <w:pPr>
         <w:bidi/>
-        <w:spacing w:before="100" w:beforeAutospacing="1" w:after="100" w:afterAutospacing="1" w:line="240" w:lineRule="auto"/>
+        <w:spacing w:after="0" w:line="240" w:lineRule="auto"/>
         <w:rPr>
           <w:rFonts w:ascii="Times New Roman" w:eastAsia="Times New Roman" w:hAnsi="Times New Roman" w:cs="Times New Roman"/>
           <w:sz w:val="24"/>
@@ -15244,7 +15331,7 @@
     <w:p>
       <w:pPr>
         <w:bidi/>
-        <w:spacing w:before="100" w:beforeAutospacing="1" w:after="100" w:afterAutospacing="1" w:line="240" w:lineRule="auto"/>
+        <w:spacing w:after="0" w:line="240" w:lineRule="auto"/>
         <w:rPr>
           <w:rFonts w:ascii="Times New Roman" w:eastAsia="Times New Roman" w:hAnsi="Times New Roman" w:cs="Times New Roman"/>
           <w:sz w:val="24"/>
@@ -15272,7 +15359,7 @@
     <w:p>
       <w:pPr>
         <w:bidi/>
-        <w:spacing w:before="100" w:beforeAutospacing="1" w:after="100" w:afterAutospacing="1" w:line="240" w:lineRule="auto"/>
+        <w:spacing w:after="0" w:line="240" w:lineRule="auto"/>
         <w:rPr>
           <w:rFonts w:ascii="Times New Roman" w:eastAsia="Times New Roman" w:hAnsi="Times New Roman" w:cs="Times New Roman"/>
           <w:sz w:val="24"/>
@@ -15475,7 +15562,7 @@
     <w:p>
       <w:pPr>
         <w:bidi/>
-        <w:spacing w:before="100" w:beforeAutospacing="1" w:after="100" w:afterAutospacing="1" w:line="240" w:lineRule="auto"/>
+        <w:spacing w:after="0" w:line="240" w:lineRule="auto"/>
         <w:rPr>
           <w:rFonts w:ascii="Times New Roman" w:eastAsia="Times New Roman" w:hAnsi="Times New Roman" w:cs="Times New Roman"/>
           <w:sz w:val="24"/>
@@ -15503,7 +15590,7 @@
     <w:p>
       <w:pPr>
         <w:bidi/>
-        <w:spacing w:before="100" w:beforeAutospacing="1" w:after="100" w:afterAutospacing="1" w:line="240" w:lineRule="auto"/>
+        <w:spacing w:after="0" w:line="240" w:lineRule="auto"/>
         <w:rPr>
           <w:rFonts w:ascii="Times New Roman" w:eastAsia="Times New Roman" w:hAnsi="Times New Roman" w:cs="Times New Roman"/>
           <w:sz w:val="24"/>
@@ -15539,7 +15626,7 @@
     <w:p>
       <w:pPr>
         <w:bidi/>
-        <w:spacing w:before="100" w:beforeAutospacing="1" w:after="100" w:afterAutospacing="1" w:line="240" w:lineRule="auto"/>
+        <w:spacing w:after="0" w:line="240" w:lineRule="auto"/>
         <w:rPr>
           <w:rFonts w:ascii="Times New Roman" w:eastAsia="Times New Roman" w:hAnsi="Times New Roman" w:cs="Times New Roman"/>
           <w:sz w:val="24"/>
@@ -15598,6 +15685,7 @@
           <w:sz w:val="20"/>
           <w:szCs w:val="20"/>
         </w:rPr>
+        <w:lastRenderedPageBreak/>
         <w:t>FeatureRegistry</w:t>
       </w:r>
       <w:proofErr w:type="spellEnd"/>
@@ -15605,7 +15693,7 @@
     <w:p>
       <w:pPr>
         <w:bidi/>
-        <w:spacing w:before="100" w:beforeAutospacing="1" w:after="100" w:afterAutospacing="1" w:line="240" w:lineRule="auto"/>
+        <w:spacing w:after="0" w:line="240" w:lineRule="auto"/>
         <w:rPr>
           <w:rFonts w:ascii="Times New Roman" w:eastAsia="Times New Roman" w:hAnsi="Times New Roman" w:cs="Times New Roman"/>
           <w:sz w:val="24"/>
@@ -15779,7 +15867,7 @@
     <w:p>
       <w:pPr>
         <w:bidi/>
-        <w:spacing w:before="100" w:beforeAutospacing="1" w:after="100" w:afterAutospacing="1" w:line="240" w:lineRule="auto"/>
+        <w:spacing w:after="0" w:line="240" w:lineRule="auto"/>
         <w:rPr>
           <w:rFonts w:ascii="Times New Roman" w:eastAsia="Times New Roman" w:hAnsi="Times New Roman" w:cs="Times New Roman"/>
           <w:sz w:val="24"/>
@@ -15828,7 +15916,7 @@
     <w:p>
       <w:pPr>
         <w:bidi/>
-        <w:spacing w:before="100" w:beforeAutospacing="1" w:after="100" w:afterAutospacing="1" w:line="240" w:lineRule="auto"/>
+        <w:spacing w:after="0" w:line="240" w:lineRule="auto"/>
         <w:outlineLvl w:val="1"/>
         <w:rPr>
           <w:rFonts w:ascii="Times New Roman" w:eastAsia="Times New Roman" w:hAnsi="Times New Roman" w:cs="Times New Roman"/>
@@ -16775,7 +16863,7 @@
     <w:p>
       <w:pPr>
         <w:bidi/>
-        <w:spacing w:before="100" w:beforeAutospacing="1" w:after="100" w:afterAutospacing="1" w:line="240" w:lineRule="auto"/>
+        <w:spacing w:after="0" w:line="240" w:lineRule="auto"/>
         <w:rPr>
           <w:rFonts w:ascii="Times New Roman" w:eastAsia="Times New Roman" w:hAnsi="Times New Roman" w:cs="Times New Roman"/>
           <w:sz w:val="24"/>
@@ -16937,12 +17025,22 @@
       </w:pPr>
       <w:r>
         <w:rPr>
-          <w:rFonts w:ascii="Times New Roman" w:eastAsia="Times New Roman" w:hAnsi="Times New Roman" w:cs="Times New Roman"/>
+          <w:rFonts w:ascii="Times New Roman" w:eastAsia="Times New Roman" w:hAnsi="Times New Roman" w:cs="Times New Roman" w:hint="cs"/>
           <w:sz w:val="24"/>
           <w:szCs w:val="24"/>
           <w:highlight w:val="yellow"/>
           <w:rtl/>
         </w:rPr>
+        <w:t xml:space="preserve">من گفتم: </w:t>
+      </w:r>
+      <w:r>
+        <w:rPr>
+          <w:rFonts w:ascii="Times New Roman" w:eastAsia="Times New Roman" w:hAnsi="Times New Roman" w:cs="Times New Roman"/>
+          <w:sz w:val="24"/>
+          <w:szCs w:val="24"/>
+          <w:highlight w:val="yellow"/>
+          <w:rtl/>
+        </w:rPr>
         <w:t>کاملاً موافق هستم. فقط در بخش 3 خروجی لایه</w:t>
       </w:r>
       <w:r>
@@ -17094,7 +17192,7 @@
     <w:p>
       <w:pPr>
         <w:bidi/>
-        <w:spacing w:before="100" w:beforeAutospacing="1" w:after="100" w:afterAutospacing="1" w:line="240" w:lineRule="auto"/>
+        <w:spacing w:after="0" w:line="240" w:lineRule="auto"/>
         <w:rPr>
           <w:rFonts w:ascii="Times New Roman" w:eastAsia="Times New Roman" w:hAnsi="Times New Roman" w:cs="Times New Roman"/>
           <w:sz w:val="24"/>
@@ -17122,7 +17220,7 @@
     <w:p>
       <w:pPr>
         <w:bidi/>
-        <w:spacing w:before="100" w:beforeAutospacing="1" w:after="100" w:afterAutospacing="1" w:line="240" w:lineRule="auto"/>
+        <w:spacing w:after="0" w:line="240" w:lineRule="auto"/>
         <w:rPr>
           <w:rFonts w:ascii="Times New Roman" w:eastAsia="Times New Roman" w:hAnsi="Times New Roman" w:cs="Times New Roman"/>
           <w:sz w:val="24"/>
@@ -17174,7 +17272,7 @@
           <w:numId w:val="6"/>
         </w:numPr>
         <w:bidi/>
-        <w:spacing w:before="100" w:beforeAutospacing="1" w:after="100" w:afterAutospacing="1" w:line="240" w:lineRule="auto"/>
+        <w:spacing w:after="0" w:line="240" w:lineRule="auto"/>
         <w:rPr>
           <w:rFonts w:ascii="Times New Roman" w:eastAsia="Times New Roman" w:hAnsi="Times New Roman" w:cs="Times New Roman"/>
           <w:sz w:val="24"/>
@@ -17233,7 +17331,7 @@
           <w:numId w:val="6"/>
         </w:numPr>
         <w:bidi/>
-        <w:spacing w:before="100" w:beforeAutospacing="1" w:after="100" w:afterAutospacing="1" w:line="240" w:lineRule="auto"/>
+        <w:spacing w:after="0" w:line="240" w:lineRule="auto"/>
         <w:rPr>
           <w:rFonts w:ascii="Times New Roman" w:eastAsia="Times New Roman" w:hAnsi="Times New Roman" w:cs="Times New Roman"/>
           <w:sz w:val="24"/>
@@ -17327,7 +17425,7 @@
           <w:numId w:val="6"/>
         </w:numPr>
         <w:bidi/>
-        <w:spacing w:before="100" w:beforeAutospacing="1" w:after="100" w:afterAutospacing="1" w:line="240" w:lineRule="auto"/>
+        <w:spacing w:after="0" w:line="240" w:lineRule="auto"/>
         <w:rPr>
           <w:rFonts w:ascii="Times New Roman" w:eastAsia="Times New Roman" w:hAnsi="Times New Roman" w:cs="Times New Roman"/>
           <w:sz w:val="24"/>
@@ -17367,7 +17465,7 @@
           <w:numId w:val="6"/>
         </w:numPr>
         <w:bidi/>
-        <w:spacing w:before="100" w:beforeAutospacing="1" w:after="100" w:afterAutospacing="1" w:line="240" w:lineRule="auto"/>
+        <w:spacing w:after="0" w:line="240" w:lineRule="auto"/>
         <w:rPr>
           <w:rFonts w:ascii="Times New Roman" w:eastAsia="Times New Roman" w:hAnsi="Times New Roman" w:cs="Times New Roman"/>
           <w:sz w:val="24"/>
@@ -17407,7 +17505,7 @@
           <w:numId w:val="6"/>
         </w:numPr>
         <w:bidi/>
-        <w:spacing w:before="100" w:beforeAutospacing="1" w:after="100" w:afterAutospacing="1" w:line="240" w:lineRule="auto"/>
+        <w:spacing w:after="0" w:line="240" w:lineRule="auto"/>
         <w:rPr>
           <w:rFonts w:ascii="Times New Roman" w:eastAsia="Times New Roman" w:hAnsi="Times New Roman" w:cs="Times New Roman"/>
           <w:sz w:val="24"/>
@@ -17447,7 +17545,7 @@
           <w:numId w:val="6"/>
         </w:numPr>
         <w:bidi/>
-        <w:spacing w:before="100" w:beforeAutospacing="1" w:after="100" w:afterAutospacing="1" w:line="240" w:lineRule="auto"/>
+        <w:spacing w:after="0" w:line="240" w:lineRule="auto"/>
         <w:rPr>
           <w:rFonts w:ascii="Times New Roman" w:eastAsia="Times New Roman" w:hAnsi="Times New Roman" w:cs="Times New Roman"/>
           <w:sz w:val="24"/>
@@ -17492,7 +17590,7 @@
     <w:p>
       <w:pPr>
         <w:bidi/>
-        <w:spacing w:before="100" w:beforeAutospacing="1" w:after="100" w:afterAutospacing="1" w:line="240" w:lineRule="auto"/>
+        <w:spacing w:after="0" w:line="240" w:lineRule="auto"/>
         <w:rPr>
           <w:rFonts w:ascii="Times New Roman" w:eastAsia="Times New Roman" w:hAnsi="Times New Roman" w:cs="Times New Roman"/>
           <w:sz w:val="24"/>
@@ -17994,6 +18092,7 @@
           <w:sz w:val="20"/>
           <w:szCs w:val="20"/>
         </w:rPr>
+        <w:lastRenderedPageBreak/>
         <w:t xml:space="preserve">      - </w:t>
       </w:r>
       <w:proofErr w:type="spellStart"/>
@@ -18010,7 +18109,7 @@
     <w:p>
       <w:pPr>
         <w:bidi/>
-        <w:spacing w:before="100" w:beforeAutospacing="1" w:after="100" w:afterAutospacing="1" w:line="240" w:lineRule="auto"/>
+        <w:spacing w:after="0" w:line="240" w:lineRule="auto"/>
         <w:rPr>
           <w:rFonts w:ascii="Times New Roman" w:eastAsia="Times New Roman" w:hAnsi="Times New Roman" w:cs="Times New Roman"/>
           <w:sz w:val="24"/>
@@ -18038,7 +18137,7 @@
     <w:p>
       <w:pPr>
         <w:bidi/>
-        <w:spacing w:before="100" w:beforeAutospacing="1" w:after="100" w:afterAutospacing="1" w:line="240" w:lineRule="auto"/>
+        <w:spacing w:after="0" w:line="240" w:lineRule="auto"/>
         <w:rPr>
           <w:rFonts w:ascii="Times New Roman" w:eastAsia="Times New Roman" w:hAnsi="Times New Roman" w:cs="Times New Roman"/>
           <w:sz w:val="24"/>
@@ -18170,7 +18269,6 @@
           <w:sz w:val="20"/>
           <w:szCs w:val="20"/>
         </w:rPr>
-        <w:lastRenderedPageBreak/>
         <w:t xml:space="preserve">    └── frames:</w:t>
       </w:r>
     </w:p>
@@ -18285,7 +18383,7 @@
     <w:p>
       <w:pPr>
         <w:bidi/>
-        <w:spacing w:before="100" w:beforeAutospacing="1" w:after="100" w:afterAutospacing="1" w:line="240" w:lineRule="auto"/>
+        <w:spacing w:after="0" w:line="240" w:lineRule="auto"/>
         <w:rPr>
           <w:rFonts w:ascii="Times New Roman" w:eastAsia="Times New Roman" w:hAnsi="Times New Roman" w:cs="Times New Roman"/>
           <w:sz w:val="24"/>
@@ -18569,7 +18667,7 @@
     <w:p>
       <w:pPr>
         <w:bidi/>
-        <w:spacing w:before="100" w:beforeAutospacing="1" w:after="100" w:afterAutospacing="1" w:line="240" w:lineRule="auto"/>
+        <w:spacing w:after="0" w:line="240" w:lineRule="auto"/>
         <w:rPr>
           <w:rFonts w:ascii="Times New Roman" w:eastAsia="Times New Roman" w:hAnsi="Times New Roman" w:cs="Times New Roman"/>
           <w:sz w:val="24"/>
@@ -18667,7 +18765,7 @@
     <w:p>
       <w:pPr>
         <w:bidi/>
-        <w:spacing w:before="100" w:beforeAutospacing="1" w:after="100" w:afterAutospacing="1" w:line="240" w:lineRule="auto"/>
+        <w:spacing w:after="0" w:line="240" w:lineRule="auto"/>
         <w:rPr>
           <w:rFonts w:ascii="Times New Roman" w:eastAsia="Times New Roman" w:hAnsi="Times New Roman" w:cs="Times New Roman"/>
           <w:sz w:val="24"/>
@@ -18799,8 +18897,6 @@
         </w:rPr>
         <w:t xml:space="preserve">    v</w:t>
       </w:r>
-      <w:bookmarkStart w:id="0" w:name="_GoBack"/>
-      <w:bookmarkEnd w:id="0"/>
     </w:p>
     <w:p>
       <w:pPr>
@@ -19227,7 +19323,7 @@
     <w:p>
       <w:pPr>
         <w:bidi/>
-        <w:spacing w:before="100" w:beforeAutospacing="1" w:after="100" w:afterAutospacing="1" w:line="240" w:lineRule="auto"/>
+        <w:spacing w:after="0" w:line="240" w:lineRule="auto"/>
         <w:rPr>
           <w:rFonts w:ascii="Times New Roman" w:eastAsia="Times New Roman" w:hAnsi="Times New Roman" w:cs="Times New Roman"/>
           <w:sz w:val="24"/>
@@ -19353,6 +19449,7 @@
     <w:p>
       <w:pPr>
         <w:bidi/>
+        <w:spacing w:after="0" w:line="240" w:lineRule="auto"/>
       </w:pPr>
     </w:p>
     <w:sectPr>

</xml_diff>